<commit_message>
Refactor test plan by removing outdated test cases and updating document structure
</commit_message>
<xml_diff>
--- a/plano de testes/Plano_de_Testes_QA_Demo_ISTQB.docx
+++ b/plano de testes/Plano_de_Testes_QA_Demo_ISTQB.docx
@@ -7563,10 +7563,6 @@
       </w:pPr>
       <w:r>
         <w:rPr/>
-        <w:t xml:space="preserve">RQ01 - </w:t>
-      </w:r>
-      <w:r>
-        <w:rPr/>
         <w:t>Listagem de propriedades</w:t>
       </w:r>
     </w:p>
@@ -7586,10 +7582,6 @@
       </w:pPr>
       <w:r>
         <w:rPr/>
-        <w:t xml:space="preserve">RQ02 - </w:t>
-      </w:r>
-      <w:r>
-        <w:rPr/>
         <w:t>Busca/Filtro</w:t>
       </w:r>
     </w:p>
@@ -7609,10 +7601,6 @@
       </w:pPr>
       <w:r>
         <w:rPr/>
-        <w:t xml:space="preserve">RQ03 - </w:t>
-      </w:r>
-      <w:r>
-        <w:rPr/>
         <w:t>Visualização de detalhes</w:t>
       </w:r>
     </w:p>
@@ -7632,10 +7620,6 @@
       </w:pPr>
       <w:r>
         <w:rPr/>
-        <w:t xml:space="preserve">RQ04 - </w:t>
-      </w:r>
-      <w:r>
-        <w:rPr/>
         <w:t>Cadastro de novos imóveis</w:t>
       </w:r>
     </w:p>
@@ -7644,13 +7628,13 @@
         <w:pStyle w:val="BodyText"/>
         <w:numPr>
           <w:ilvl w:val="0"/>
-          <w:numId w:val="8"/>
+          <w:numId w:val="0"/>
         </w:numPr>
         <w:tabs>
           <w:tab w:val="clear" w:pos="720"/>
           <w:tab w:val="left" w:pos="0" w:leader="none"/>
         </w:tabs>
-        <w:ind w:hanging="0" w:left="709"/>
+        <w:ind w:hanging="0" w:left="0"/>
         <w:rPr>
           <w:b w:val="false"/>
           <w:bCs w:val="false"/>
@@ -7661,146 +7645,6 @@
           <w:b w:val="false"/>
           <w:bCs w:val="false"/>
         </w:rPr>
-        <w:t>RNF-PER-01: Desempenho e Tempo de Carregamento da Listagem de Imóveis</w:t>
-      </w:r>
-    </w:p>
-    <w:p>
-      <w:pPr>
-        <w:pStyle w:val="BodyText"/>
-        <w:numPr>
-          <w:ilvl w:val="0"/>
-          <w:numId w:val="8"/>
-        </w:numPr>
-        <w:tabs>
-          <w:tab w:val="clear" w:pos="720"/>
-          <w:tab w:val="left" w:pos="0" w:leader="none"/>
-        </w:tabs>
-        <w:ind w:hanging="0" w:left="709"/>
-        <w:rPr>
-          <w:b w:val="false"/>
-          <w:bCs w:val="false"/>
-        </w:rPr>
-      </w:pPr>
-      <w:r>
-        <w:rPr>
-          <w:b w:val="false"/>
-          <w:bCs w:val="false"/>
-        </w:rPr>
-        <w:t>RNF-</w:t>
-      </w:r>
-      <w:r>
-        <w:rPr>
-          <w:b w:val="false"/>
-          <w:bCs w:val="false"/>
-        </w:rPr>
-        <w:t xml:space="preserve">USA </w:t>
-      </w:r>
-      <w:r>
-        <w:rPr>
-          <w:b w:val="false"/>
-          <w:bCs w:val="false"/>
-        </w:rPr>
-        <w:t>-01 - Design Responsivo e Adaptação para Dispositivos Móveis</w:t>
-      </w:r>
-    </w:p>
-    <w:p>
-      <w:pPr>
-        <w:pStyle w:val="BodyText"/>
-        <w:numPr>
-          <w:ilvl w:val="0"/>
-          <w:numId w:val="8"/>
-        </w:numPr>
-        <w:tabs>
-          <w:tab w:val="clear" w:pos="720"/>
-          <w:tab w:val="left" w:pos="0" w:leader="none"/>
-        </w:tabs>
-        <w:ind w:hanging="0" w:left="709"/>
-        <w:rPr>
-          <w:b w:val="false"/>
-          <w:bCs w:val="false"/>
-        </w:rPr>
-      </w:pPr>
-      <w:r>
-        <w:rPr>
-          <w:b w:val="false"/>
-          <w:bCs w:val="false"/>
-        </w:rPr>
-        <w:t>RNF-COM-01 - Compatibilidade Cross-Browser entre Navegadores</w:t>
-      </w:r>
-    </w:p>
-    <w:p>
-      <w:pPr>
-        <w:pStyle w:val="BodyText"/>
-        <w:numPr>
-          <w:ilvl w:val="0"/>
-          <w:numId w:val="8"/>
-        </w:numPr>
-        <w:tabs>
-          <w:tab w:val="clear" w:pos="720"/>
-          <w:tab w:val="left" w:pos="0" w:leader="none"/>
-        </w:tabs>
-        <w:ind w:hanging="0" w:left="709"/>
-        <w:rPr>
-          <w:b w:val="false"/>
-          <w:bCs w:val="false"/>
-        </w:rPr>
-      </w:pPr>
-      <w:r>
-        <w:rPr>
-          <w:b w:val="false"/>
-          <w:bCs w:val="false"/>
-        </w:rPr>
-        <w:t>RNF-ACE-01-  Acessibilidade Web Baseada nas Diretrizes WCAG</w:t>
-      </w:r>
-    </w:p>
-    <w:p>
-      <w:pPr>
-        <w:pStyle w:val="BodyText"/>
-        <w:numPr>
-          <w:ilvl w:val="0"/>
-          <w:numId w:val="8"/>
-        </w:numPr>
-        <w:tabs>
-          <w:tab w:val="clear" w:pos="720"/>
-          <w:tab w:val="left" w:pos="0" w:leader="none"/>
-        </w:tabs>
-        <w:ind w:hanging="0" w:left="709"/>
-        <w:rPr>
-          <w:b w:val="false"/>
-          <w:bCs w:val="false"/>
-        </w:rPr>
-      </w:pPr>
-      <w:r>
-        <w:rPr>
-          <w:b w:val="false"/>
-          <w:bCs w:val="false"/>
-        </w:rPr>
-        <w:t>RNF-SEG-01- Proteção contra Injeção de Código Malicioso na Consulta de Imóveis</w:t>
-      </w:r>
-    </w:p>
-    <w:p>
-      <w:pPr>
-        <w:pStyle w:val="BodyText"/>
-        <w:numPr>
-          <w:ilvl w:val="0"/>
-          <w:numId w:val="8"/>
-        </w:numPr>
-        <w:tabs>
-          <w:tab w:val="clear" w:pos="720"/>
-          <w:tab w:val="left" w:pos="0" w:leader="none"/>
-        </w:tabs>
-        <w:ind w:hanging="0" w:left="709"/>
-        <w:rPr>
-          <w:b w:val="false"/>
-          <w:bCs w:val="false"/>
-        </w:rPr>
-      </w:pPr>
-      <w:r>
-        <w:rPr>
-          <w:b w:val="false"/>
-          <w:bCs w:val="false"/>
-        </w:rPr>
-        <w:t>RNF-SEG-02- Proteção contra Armazenamento de Scripts Maliciosos no Formulário de Cadastro</w:t>
       </w:r>
     </w:p>
     <w:p>
@@ -11551,7 +11395,7 @@
       </w:pPr>
       <w:r>
         <w:rPr/>
-        <w:t xml:space="preserve">Cadastro de imóvel válido. </w:t>
+        <w:t xml:space="preserve">Cadastro de imóvel válido.  </w:t>
       </w:r>
     </w:p>
     <w:p>
@@ -11571,46 +11415,7 @@
       </w:pPr>
       <w:r>
         <w:rPr/>
-        <w:t xml:space="preserve">Validação de campos obrigatórios. </w:t>
-      </w:r>
-    </w:p>
-    <w:p>
-      <w:pPr>
-        <w:pStyle w:val="BodyText"/>
-        <w:numPr>
-          <w:ilvl w:val="0"/>
-          <w:numId w:val="34"/>
-        </w:numPr>
-        <w:tabs>
-          <w:tab w:val="clear" w:pos="720"/>
-          <w:tab w:val="left" w:pos="0" w:leader="none"/>
-        </w:tabs>
-        <w:spacing w:before="0" w:after="0"/>
-        <w:ind w:hanging="283" w:left="709"/>
-        <w:rPr/>
-      </w:pPr>
-      <w:r>
-        <w:rPr/>
-        <w:t xml:space="preserve">Visualização dos detalhes do imóvel. </w:t>
-      </w:r>
-    </w:p>
-    <w:p>
-      <w:pPr>
-        <w:pStyle w:val="BodyText"/>
-        <w:numPr>
-          <w:ilvl w:val="0"/>
-          <w:numId w:val="34"/>
-        </w:numPr>
-        <w:tabs>
-          <w:tab w:val="clear" w:pos="720"/>
-          <w:tab w:val="left" w:pos="0" w:leader="none"/>
-        </w:tabs>
-        <w:ind w:hanging="283" w:left="709"/>
-        <w:rPr/>
-      </w:pPr>
-      <w:r>
-        <w:rPr/>
-        <w:t xml:space="preserve">Navegação entre páginas. </w:t>
+        <w:t xml:space="preserve">Visualização dos detalhes do imóvel.  </w:t>
       </w:r>
     </w:p>
     <w:p>
@@ -12034,7 +11839,11 @@
       </w:pPr>
       <w:r>
         <w:rPr/>
-        <w:t>Cada funcionalidade será classificada conforme seu impacto para o negócio e sua probabilidade de falha.</w:t>
+        <w:t xml:space="preserve">Cada funcionalidade será classificada conforme seu impacto para o negócio e sua probabilidade de falha </w:t>
+      </w:r>
+      <w:r>
+        <w:rPr/>
+        <w:t>de acordo com a tabela de analise de riscos.</w:t>
       </w:r>
     </w:p>
     <w:p>
@@ -12059,358 +11868,6 @@
         <w:t>As funcionalidades abaixo representam o principal objetivo da aplicação e terão prioridade máxima durante todas as fases de testes.</w:t>
       </w:r>
     </w:p>
-    <w:tbl>
-      <w:tblPr>
-        <w:tblW w:w="8640" w:type="dxa"/>
-        <w:jc w:val="left"/>
-        <w:tblInd w:w="28" w:type="dxa"/>
-        <w:tblLayout w:type="fixed"/>
-        <w:tblCellMar>
-          <w:top w:w="28" w:type="dxa"/>
-          <w:left w:w="28" w:type="dxa"/>
-          <w:bottom w:w="28" w:type="dxa"/>
-          <w:right w:w="28" w:type="dxa"/>
-        </w:tblCellMar>
-      </w:tblPr>
-      <w:tblGrid>
-        <w:gridCol w:w="2018"/>
-        <w:gridCol w:w="5371"/>
-        <w:gridCol w:w="1251"/>
-      </w:tblGrid>
-      <w:tr>
-        <w:trPr>
-          <w:tblHeader w:val="true"/>
-        </w:trPr>
-        <w:tc>
-          <w:tcPr>
-            <w:tcW w:w="2018" w:type="dxa"/>
-            <w:tcBorders/>
-            <w:vAlign w:val="center"/>
-          </w:tcPr>
-          <w:p>
-            <w:pPr>
-              <w:pStyle w:val="Ttulodetabelauser"/>
-              <w:suppressLineNumbers/>
-              <w:spacing w:before="0" w:after="200"/>
-              <w:jc w:val="center"/>
-              <w:rPr/>
-            </w:pPr>
-            <w:r>
-              <w:rPr/>
-              <w:t>Funcionalidade</w:t>
-            </w:r>
-          </w:p>
-        </w:tc>
-        <w:tc>
-          <w:tcPr>
-            <w:tcW w:w="5371" w:type="dxa"/>
-            <w:tcBorders/>
-            <w:vAlign w:val="center"/>
-          </w:tcPr>
-          <w:p>
-            <w:pPr>
-              <w:pStyle w:val="Ttulodetabelauser"/>
-              <w:suppressLineNumbers/>
-              <w:spacing w:before="0" w:after="200"/>
-              <w:jc w:val="center"/>
-              <w:rPr/>
-            </w:pPr>
-            <w:r>
-              <w:rPr/>
-              <w:t>Impacto caso falhe</w:t>
-            </w:r>
-          </w:p>
-        </w:tc>
-        <w:tc>
-          <w:tcPr>
-            <w:tcW w:w="1251" w:type="dxa"/>
-            <w:tcBorders/>
-            <w:vAlign w:val="center"/>
-          </w:tcPr>
-          <w:p>
-            <w:pPr>
-              <w:pStyle w:val="Ttulodetabelauser"/>
-              <w:suppressLineNumbers/>
-              <w:spacing w:before="0" w:after="200"/>
-              <w:jc w:val="center"/>
-              <w:rPr/>
-            </w:pPr>
-            <w:r>
-              <w:rPr/>
-              <w:t>Prioridade</w:t>
-            </w:r>
-          </w:p>
-        </w:tc>
-      </w:tr>
-      <w:tr>
-        <w:trPr/>
-        <w:tc>
-          <w:tcPr>
-            <w:tcW w:w="2018" w:type="dxa"/>
-            <w:tcBorders/>
-            <w:vAlign w:val="center"/>
-          </w:tcPr>
-          <w:p>
-            <w:pPr>
-              <w:pStyle w:val="Contedodatabelauser"/>
-              <w:widowControl w:val="false"/>
-              <w:suppressLineNumbers/>
-              <w:spacing w:before="0" w:after="200"/>
-              <w:rPr/>
-            </w:pPr>
-            <w:r>
-              <w:rPr/>
-              <w:t>Cadastro de imóvel</w:t>
-            </w:r>
-          </w:p>
-        </w:tc>
-        <w:tc>
-          <w:tcPr>
-            <w:tcW w:w="5371" w:type="dxa"/>
-            <w:tcBorders/>
-            <w:vAlign w:val="center"/>
-          </w:tcPr>
-          <w:p>
-            <w:pPr>
-              <w:pStyle w:val="Contedodatabelauser"/>
-              <w:widowControl w:val="false"/>
-              <w:suppressLineNumbers/>
-              <w:spacing w:before="0" w:after="200"/>
-              <w:rPr/>
-            </w:pPr>
-            <w:r>
-              <w:rPr/>
-              <w:t>Novos imóveis não podem ser registrados</w:t>
-            </w:r>
-          </w:p>
-        </w:tc>
-        <w:tc>
-          <w:tcPr>
-            <w:tcW w:w="1251" w:type="dxa"/>
-            <w:tcBorders/>
-            <w:vAlign w:val="center"/>
-          </w:tcPr>
-          <w:p>
-            <w:pPr>
-              <w:pStyle w:val="Contedodatabelauser"/>
-              <w:widowControl w:val="false"/>
-              <w:suppressLineNumbers/>
-              <w:spacing w:before="0" w:after="200"/>
-              <w:rPr/>
-            </w:pPr>
-            <w:r>
-              <w:rPr/>
-              <w:t xml:space="preserve">🔴 </w:t>
-            </w:r>
-            <w:r>
-              <w:rPr/>
-              <w:t>Crítica</w:t>
-            </w:r>
-          </w:p>
-        </w:tc>
-      </w:tr>
-      <w:tr>
-        <w:trPr/>
-        <w:tc>
-          <w:tcPr>
-            <w:tcW w:w="2018" w:type="dxa"/>
-            <w:tcBorders/>
-            <w:vAlign w:val="center"/>
-          </w:tcPr>
-          <w:p>
-            <w:pPr>
-              <w:pStyle w:val="Contedodatabelauser"/>
-              <w:widowControl w:val="false"/>
-              <w:suppressLineNumbers/>
-              <w:spacing w:before="0" w:after="200"/>
-              <w:rPr/>
-            </w:pPr>
-            <w:r>
-              <w:rPr/>
-              <w:t>Listagem de imóveis</w:t>
-            </w:r>
-          </w:p>
-        </w:tc>
-        <w:tc>
-          <w:tcPr>
-            <w:tcW w:w="5371" w:type="dxa"/>
-            <w:tcBorders/>
-            <w:vAlign w:val="center"/>
-          </w:tcPr>
-          <w:p>
-            <w:pPr>
-              <w:pStyle w:val="Contedodatabelauser"/>
-              <w:widowControl w:val="false"/>
-              <w:suppressLineNumbers/>
-              <w:spacing w:before="0" w:after="200"/>
-              <w:rPr/>
-            </w:pPr>
-            <w:r>
-              <w:rPr/>
-              <w:t>Usuários não conseguem visualizar os imóveis disponíveis</w:t>
-            </w:r>
-          </w:p>
-        </w:tc>
-        <w:tc>
-          <w:tcPr>
-            <w:tcW w:w="1251" w:type="dxa"/>
-            <w:tcBorders/>
-            <w:vAlign w:val="center"/>
-          </w:tcPr>
-          <w:p>
-            <w:pPr>
-              <w:pStyle w:val="Contedodatabelauser"/>
-              <w:widowControl w:val="false"/>
-              <w:suppressLineNumbers/>
-              <w:spacing w:before="0" w:after="200"/>
-              <w:rPr/>
-            </w:pPr>
-            <w:r>
-              <w:rPr/>
-              <w:t xml:space="preserve">🔴 </w:t>
-            </w:r>
-            <w:r>
-              <w:rPr/>
-              <w:t>Crítica</w:t>
-            </w:r>
-          </w:p>
-        </w:tc>
-      </w:tr>
-      <w:tr>
-        <w:trPr/>
-        <w:tc>
-          <w:tcPr>
-            <w:tcW w:w="2018" w:type="dxa"/>
-            <w:tcBorders/>
-            <w:vAlign w:val="center"/>
-          </w:tcPr>
-          <w:p>
-            <w:pPr>
-              <w:pStyle w:val="Contedodatabelauser"/>
-              <w:widowControl w:val="false"/>
-              <w:suppressLineNumbers/>
-              <w:spacing w:before="0" w:after="200"/>
-              <w:rPr/>
-            </w:pPr>
-            <w:r>
-              <w:rPr/>
-              <w:t>Busca de imóveis</w:t>
-            </w:r>
-          </w:p>
-        </w:tc>
-        <w:tc>
-          <w:tcPr>
-            <w:tcW w:w="5371" w:type="dxa"/>
-            <w:tcBorders/>
-            <w:vAlign w:val="center"/>
-          </w:tcPr>
-          <w:p>
-            <w:pPr>
-              <w:pStyle w:val="Contedodatabelauser"/>
-              <w:widowControl w:val="false"/>
-              <w:suppressLineNumbers/>
-              <w:spacing w:before="0" w:after="200"/>
-              <w:rPr/>
-            </w:pPr>
-            <w:r>
-              <w:rPr/>
-              <w:t>Dificulta a localização de imóveis</w:t>
-            </w:r>
-          </w:p>
-        </w:tc>
-        <w:tc>
-          <w:tcPr>
-            <w:tcW w:w="1251" w:type="dxa"/>
-            <w:tcBorders/>
-            <w:vAlign w:val="center"/>
-          </w:tcPr>
-          <w:p>
-            <w:pPr>
-              <w:pStyle w:val="Contedodatabelauser"/>
-              <w:widowControl w:val="false"/>
-              <w:suppressLineNumbers/>
-              <w:spacing w:before="0" w:after="200"/>
-              <w:rPr/>
-            </w:pPr>
-            <w:r>
-              <w:rPr/>
-              <w:t xml:space="preserve">🔴 </w:t>
-            </w:r>
-            <w:r>
-              <w:rPr/>
-              <w:t>Crítica</w:t>
-            </w:r>
-          </w:p>
-        </w:tc>
-      </w:tr>
-      <w:tr>
-        <w:trPr/>
-        <w:tc>
-          <w:tcPr>
-            <w:tcW w:w="2018" w:type="dxa"/>
-            <w:tcBorders/>
-            <w:vAlign w:val="center"/>
-          </w:tcPr>
-          <w:p>
-            <w:pPr>
-              <w:pStyle w:val="Contedodatabelauser"/>
-              <w:widowControl w:val="false"/>
-              <w:suppressLineNumbers/>
-              <w:spacing w:before="0" w:after="200"/>
-              <w:rPr/>
-            </w:pPr>
-            <w:r>
-              <w:rPr/>
-              <w:t>Filtro de imóveis</w:t>
-            </w:r>
-          </w:p>
-        </w:tc>
-        <w:tc>
-          <w:tcPr>
-            <w:tcW w:w="5371" w:type="dxa"/>
-            <w:tcBorders/>
-            <w:vAlign w:val="center"/>
-          </w:tcPr>
-          <w:p>
-            <w:pPr>
-              <w:pStyle w:val="Contedodatabelauser"/>
-              <w:widowControl w:val="false"/>
-              <w:suppressLineNumbers/>
-              <w:spacing w:before="0" w:after="200"/>
-              <w:rPr/>
-            </w:pPr>
-            <w:r>
-              <w:rPr/>
-              <w:t>Compromete a pesquisa por critérios específicos</w:t>
-            </w:r>
-          </w:p>
-        </w:tc>
-        <w:tc>
-          <w:tcPr>
-            <w:tcW w:w="1251" w:type="dxa"/>
-            <w:tcBorders/>
-            <w:vAlign w:val="center"/>
-          </w:tcPr>
-          <w:p>
-            <w:pPr>
-              <w:pStyle w:val="Contedodatabelauser"/>
-              <w:widowControl w:val="false"/>
-              <w:suppressLineNumbers/>
-              <w:spacing w:before="0" w:after="200"/>
-              <w:rPr/>
-            </w:pPr>
-            <w:r>
-              <w:rPr/>
-              <w:t xml:space="preserve">🔴 </w:t>
-            </w:r>
-            <w:r>
-              <w:rPr/>
-              <w:t>Crítica</w:t>
-            </w:r>
-          </w:p>
-        </w:tc>
-      </w:tr>
-    </w:tbl>
     <w:p>
       <w:pPr>
         <w:pStyle w:val="Heading3"/>
@@ -12562,241 +12019,6 @@
         <w:t>Fluxos de Médio Risco</w:t>
       </w:r>
     </w:p>
-    <w:tbl>
-      <w:tblPr>
-        <w:tblW w:w="4463" w:type="dxa"/>
-        <w:jc w:val="left"/>
-        <w:tblInd w:w="28" w:type="dxa"/>
-        <w:tblLayout w:type="fixed"/>
-        <w:tblCellMar>
-          <w:top w:w="28" w:type="dxa"/>
-          <w:left w:w="28" w:type="dxa"/>
-          <w:bottom w:w="28" w:type="dxa"/>
-          <w:right w:w="28" w:type="dxa"/>
-        </w:tblCellMar>
-      </w:tblPr>
-      <w:tblGrid>
-        <w:gridCol w:w="3482"/>
-        <w:gridCol w:w="980"/>
-      </w:tblGrid>
-      <w:tr>
-        <w:trPr>
-          <w:tblHeader w:val="true"/>
-        </w:trPr>
-        <w:tc>
-          <w:tcPr>
-            <w:tcW w:w="3482" w:type="dxa"/>
-            <w:tcBorders/>
-            <w:vAlign w:val="center"/>
-          </w:tcPr>
-          <w:p>
-            <w:pPr>
-              <w:pStyle w:val="Ttulodetabelauser"/>
-              <w:suppressLineNumbers/>
-              <w:spacing w:before="0" w:after="200"/>
-              <w:jc w:val="center"/>
-              <w:rPr/>
-            </w:pPr>
-            <w:r>
-              <w:rPr/>
-              <w:t>Funcionalidade</w:t>
-            </w:r>
-          </w:p>
-        </w:tc>
-        <w:tc>
-          <w:tcPr>
-            <w:tcW w:w="980" w:type="dxa"/>
-            <w:tcBorders/>
-            <w:vAlign w:val="center"/>
-          </w:tcPr>
-          <w:p>
-            <w:pPr>
-              <w:pStyle w:val="Ttulodetabelauser"/>
-              <w:suppressLineNumbers/>
-              <w:spacing w:before="0" w:after="200"/>
-              <w:jc w:val="center"/>
-              <w:rPr/>
-            </w:pPr>
-            <w:r>
-              <w:rPr/>
-              <w:t>Impacto</w:t>
-            </w:r>
-          </w:p>
-        </w:tc>
-      </w:tr>
-      <w:tr>
-        <w:trPr/>
-        <w:tc>
-          <w:tcPr>
-            <w:tcW w:w="3482" w:type="dxa"/>
-            <w:tcBorders/>
-            <w:vAlign w:val="center"/>
-          </w:tcPr>
-          <w:p>
-            <w:pPr>
-              <w:pStyle w:val="Contedodatabelauser"/>
-              <w:widowControl w:val="false"/>
-              <w:suppressLineNumbers/>
-              <w:spacing w:before="0" w:after="200"/>
-              <w:rPr/>
-            </w:pPr>
-            <w:r>
-              <w:rPr/>
-              <w:t>Visualização dos detalhes do imóvel</w:t>
-            </w:r>
-          </w:p>
-        </w:tc>
-        <w:tc>
-          <w:tcPr>
-            <w:tcW w:w="980" w:type="dxa"/>
-            <w:tcBorders/>
-            <w:vAlign w:val="center"/>
-          </w:tcPr>
-          <w:p>
-            <w:pPr>
-              <w:pStyle w:val="Contedodatabelauser"/>
-              <w:widowControl w:val="false"/>
-              <w:suppressLineNumbers/>
-              <w:spacing w:before="0" w:after="200"/>
-              <w:rPr/>
-            </w:pPr>
-            <w:r>
-              <w:rPr/>
-              <w:t>Médio</w:t>
-            </w:r>
-          </w:p>
-        </w:tc>
-      </w:tr>
-      <w:tr>
-        <w:trPr/>
-        <w:tc>
-          <w:tcPr>
-            <w:tcW w:w="3482" w:type="dxa"/>
-            <w:tcBorders/>
-            <w:vAlign w:val="center"/>
-          </w:tcPr>
-          <w:p>
-            <w:pPr>
-              <w:pStyle w:val="Contedodatabelauser"/>
-              <w:widowControl w:val="false"/>
-              <w:suppressLineNumbers/>
-              <w:spacing w:before="0" w:after="200"/>
-              <w:rPr/>
-            </w:pPr>
-            <w:r>
-              <w:rPr/>
-              <w:t>Navegação entre páginas</w:t>
-            </w:r>
-          </w:p>
-        </w:tc>
-        <w:tc>
-          <w:tcPr>
-            <w:tcW w:w="980" w:type="dxa"/>
-            <w:tcBorders/>
-            <w:vAlign w:val="center"/>
-          </w:tcPr>
-          <w:p>
-            <w:pPr>
-              <w:pStyle w:val="Contedodatabelauser"/>
-              <w:widowControl w:val="false"/>
-              <w:suppressLineNumbers/>
-              <w:spacing w:before="0" w:after="200"/>
-              <w:rPr/>
-            </w:pPr>
-            <w:r>
-              <w:rPr/>
-              <w:t>Médio</w:t>
-            </w:r>
-          </w:p>
-        </w:tc>
-      </w:tr>
-      <w:tr>
-        <w:trPr/>
-        <w:tc>
-          <w:tcPr>
-            <w:tcW w:w="3482" w:type="dxa"/>
-            <w:tcBorders/>
-            <w:vAlign w:val="center"/>
-          </w:tcPr>
-          <w:p>
-            <w:pPr>
-              <w:pStyle w:val="Contedodatabelauser"/>
-              <w:widowControl w:val="false"/>
-              <w:suppressLineNumbers/>
-              <w:spacing w:before="0" w:after="200"/>
-              <w:rPr/>
-            </w:pPr>
-            <w:r>
-              <w:rPr/>
-              <w:t>Responsividade</w:t>
-            </w:r>
-          </w:p>
-        </w:tc>
-        <w:tc>
-          <w:tcPr>
-            <w:tcW w:w="980" w:type="dxa"/>
-            <w:tcBorders/>
-            <w:vAlign w:val="center"/>
-          </w:tcPr>
-          <w:p>
-            <w:pPr>
-              <w:pStyle w:val="Contedodatabelauser"/>
-              <w:widowControl w:val="false"/>
-              <w:suppressLineNumbers/>
-              <w:spacing w:before="0" w:after="200"/>
-              <w:rPr/>
-            </w:pPr>
-            <w:r>
-              <w:rPr/>
-              <w:t>Médio</w:t>
-            </w:r>
-          </w:p>
-        </w:tc>
-      </w:tr>
-      <w:tr>
-        <w:trPr/>
-        <w:tc>
-          <w:tcPr>
-            <w:tcW w:w="3482" w:type="dxa"/>
-            <w:tcBorders/>
-            <w:vAlign w:val="center"/>
-          </w:tcPr>
-          <w:p>
-            <w:pPr>
-              <w:pStyle w:val="Contedodatabelauser"/>
-              <w:widowControl w:val="false"/>
-              <w:suppressLineNumbers/>
-              <w:spacing w:before="0" w:after="200"/>
-              <w:rPr/>
-            </w:pPr>
-            <w:r>
-              <w:rPr/>
-              <w:t>Mensagens de erro</w:t>
-            </w:r>
-          </w:p>
-        </w:tc>
-        <w:tc>
-          <w:tcPr>
-            <w:tcW w:w="980" w:type="dxa"/>
-            <w:tcBorders/>
-            <w:vAlign w:val="center"/>
-          </w:tcPr>
-          <w:p>
-            <w:pPr>
-              <w:pStyle w:val="Contedodatabelauser"/>
-              <w:widowControl w:val="false"/>
-              <w:suppressLineNumbers/>
-              <w:spacing w:before="0" w:after="200"/>
-              <w:rPr/>
-            </w:pPr>
-            <w:r>
-              <w:rPr/>
-              <w:t>Médio</w:t>
-            </w:r>
-          </w:p>
-        </w:tc>
-      </w:tr>
-    </w:tbl>
     <w:p>
       <w:pPr>
         <w:pStyle w:val="Heading3"/>
@@ -12888,198 +12110,6 @@
         <w:t>Fluxos de Baixo Risco</w:t>
       </w:r>
     </w:p>
-    <w:tbl>
-      <w:tblPr>
-        <w:tblW w:w="3668" w:type="dxa"/>
-        <w:jc w:val="left"/>
-        <w:tblInd w:w="28" w:type="dxa"/>
-        <w:tblLayout w:type="fixed"/>
-        <w:tblCellMar>
-          <w:top w:w="28" w:type="dxa"/>
-          <w:left w:w="28" w:type="dxa"/>
-          <w:bottom w:w="28" w:type="dxa"/>
-          <w:right w:w="28" w:type="dxa"/>
-        </w:tblCellMar>
-      </w:tblPr>
-      <w:tblGrid>
-        <w:gridCol w:w="2687"/>
-        <w:gridCol w:w="980"/>
-      </w:tblGrid>
-      <w:tr>
-        <w:trPr>
-          <w:tblHeader w:val="true"/>
-        </w:trPr>
-        <w:tc>
-          <w:tcPr>
-            <w:tcW w:w="2687" w:type="dxa"/>
-            <w:tcBorders/>
-            <w:vAlign w:val="center"/>
-          </w:tcPr>
-          <w:p>
-            <w:pPr>
-              <w:pStyle w:val="Ttulodetabelauser"/>
-              <w:suppressLineNumbers/>
-              <w:spacing w:before="0" w:after="200"/>
-              <w:jc w:val="center"/>
-              <w:rPr/>
-            </w:pPr>
-            <w:r>
-              <w:rPr/>
-              <w:t>Funcionalidade</w:t>
-            </w:r>
-          </w:p>
-        </w:tc>
-        <w:tc>
-          <w:tcPr>
-            <w:tcW w:w="980" w:type="dxa"/>
-            <w:tcBorders/>
-            <w:vAlign w:val="center"/>
-          </w:tcPr>
-          <w:p>
-            <w:pPr>
-              <w:pStyle w:val="Ttulodetabelauser"/>
-              <w:suppressLineNumbers/>
-              <w:spacing w:before="0" w:after="200"/>
-              <w:jc w:val="center"/>
-              <w:rPr/>
-            </w:pPr>
-            <w:r>
-              <w:rPr/>
-              <w:t>Impacto</w:t>
-            </w:r>
-          </w:p>
-        </w:tc>
-      </w:tr>
-      <w:tr>
-        <w:trPr/>
-        <w:tc>
-          <w:tcPr>
-            <w:tcW w:w="2687" w:type="dxa"/>
-            <w:tcBorders/>
-            <w:vAlign w:val="center"/>
-          </w:tcPr>
-          <w:p>
-            <w:pPr>
-              <w:pStyle w:val="Contedodatabelauser"/>
-              <w:widowControl w:val="false"/>
-              <w:suppressLineNumbers/>
-              <w:spacing w:before="0" w:after="200"/>
-              <w:rPr/>
-            </w:pPr>
-            <w:r>
-              <w:rPr/>
-              <w:t>Textos informativos</w:t>
-            </w:r>
-          </w:p>
-        </w:tc>
-        <w:tc>
-          <w:tcPr>
-            <w:tcW w:w="980" w:type="dxa"/>
-            <w:tcBorders/>
-            <w:vAlign w:val="center"/>
-          </w:tcPr>
-          <w:p>
-            <w:pPr>
-              <w:pStyle w:val="Contedodatabelauser"/>
-              <w:widowControl w:val="false"/>
-              <w:suppressLineNumbers/>
-              <w:spacing w:before="0" w:after="200"/>
-              <w:rPr/>
-            </w:pPr>
-            <w:r>
-              <w:rPr/>
-              <w:t>Baixo</w:t>
-            </w:r>
-          </w:p>
-        </w:tc>
-      </w:tr>
-      <w:tr>
-        <w:trPr/>
-        <w:tc>
-          <w:tcPr>
-            <w:tcW w:w="2687" w:type="dxa"/>
-            <w:tcBorders/>
-            <w:vAlign w:val="center"/>
-          </w:tcPr>
-          <w:p>
-            <w:pPr>
-              <w:pStyle w:val="Contedodatabelauser"/>
-              <w:widowControl w:val="false"/>
-              <w:suppressLineNumbers/>
-              <w:spacing w:before="0" w:after="200"/>
-              <w:rPr/>
-            </w:pPr>
-            <w:r>
-              <w:rPr/>
-              <w:t>Rodapé</w:t>
-            </w:r>
-          </w:p>
-        </w:tc>
-        <w:tc>
-          <w:tcPr>
-            <w:tcW w:w="980" w:type="dxa"/>
-            <w:tcBorders/>
-            <w:vAlign w:val="center"/>
-          </w:tcPr>
-          <w:p>
-            <w:pPr>
-              <w:pStyle w:val="Contedodatabelauser"/>
-              <w:widowControl w:val="false"/>
-              <w:suppressLineNumbers/>
-              <w:spacing w:before="0" w:after="200"/>
-              <w:rPr/>
-            </w:pPr>
-            <w:r>
-              <w:rPr/>
-              <w:t>Baixo</w:t>
-            </w:r>
-          </w:p>
-        </w:tc>
-      </w:tr>
-      <w:tr>
-        <w:trPr/>
-        <w:tc>
-          <w:tcPr>
-            <w:tcW w:w="2687" w:type="dxa"/>
-            <w:tcBorders/>
-            <w:vAlign w:val="center"/>
-          </w:tcPr>
-          <w:p>
-            <w:pPr>
-              <w:pStyle w:val="Contedodatabelauser"/>
-              <w:widowControl w:val="false"/>
-              <w:suppressLineNumbers/>
-              <w:spacing w:before="0" w:after="200"/>
-              <w:rPr/>
-            </w:pPr>
-            <w:r>
-              <w:rPr/>
-              <w:t>Elementos visuais estáticos</w:t>
-            </w:r>
-          </w:p>
-        </w:tc>
-        <w:tc>
-          <w:tcPr>
-            <w:tcW w:w="980" w:type="dxa"/>
-            <w:tcBorders/>
-            <w:vAlign w:val="center"/>
-          </w:tcPr>
-          <w:p>
-            <w:pPr>
-              <w:pStyle w:val="Contedodatabelauser"/>
-              <w:widowControl w:val="false"/>
-              <w:suppressLineNumbers/>
-              <w:spacing w:before="0" w:after="200"/>
-              <w:rPr/>
-            </w:pPr>
-            <w:r>
-              <w:rPr/>
-              <w:t>Baixo</w:t>
-            </w:r>
-          </w:p>
-        </w:tc>
-      </w:tr>
-    </w:tbl>
     <w:p>
       <w:pPr>
         <w:pStyle w:val="Heading3"/>
@@ -13912,7 +12942,11 @@
       </w:pPr>
       <w:r>
         <w:rPr/>
-        <w:t>Fluxos Críticos</w:t>
+        <w:t xml:space="preserve">Fluxos Críticos </w:t>
+      </w:r>
+      <w:r>
+        <w:rPr/>
+        <w:t>e Altos</w:t>
       </w:r>
     </w:p>
     <w:p>
@@ -13923,18 +12957,28 @@
       </w:pPr>
       <w:r>
         <w:rPr/>
-        <w:t>Os fluxos críticos receberão maior investimento em automação.</w:t>
-      </w:r>
-    </w:p>
-    <w:p>
-      <w:pPr>
-        <w:pStyle w:val="Heading3"/>
+        <w:t xml:space="preserve">Os fluxos críticos receberão maior investimento em automação. </w:t>
+      </w:r>
+    </w:p>
+    <w:p>
+      <w:pPr>
+        <w:pStyle w:val="Linhahorizontaluser"/>
         <w:spacing w:before="0" w:after="200"/>
         <w:rPr/>
       </w:pPr>
       <w:r>
         <w:rPr/>
-        <w:t>Cadastro de Imóvel</w:t>
+      </w:r>
+    </w:p>
+    <w:p>
+      <w:pPr>
+        <w:pStyle w:val="Heading1"/>
+        <w:spacing w:before="0" w:after="200"/>
+        <w:rPr/>
+      </w:pPr>
+      <w:r>
+        <w:rPr/>
+        <w:t>Pilar 3 – Quality Focus</w:t>
       </w:r>
     </w:p>
     <w:p>
@@ -13944,10 +12988,19 @@
         <w:rPr/>
       </w:pPr>
       <w:r>
-        <w:rPr>
-          <w:rStyle w:val="Strong"/>
-        </w:rPr>
-        <w:t>Testes Unitários</w:t>
+        <w:rPr/>
+        <w:t>A qualidade do produto não será avaliada apenas pelo número de testes executados ou pela cobertura de código.</w:t>
+      </w:r>
+    </w:p>
+    <w:p>
+      <w:pPr>
+        <w:pStyle w:val="BodyText"/>
+        <w:spacing w:before="0" w:after="200"/>
+        <w:rPr/>
+      </w:pPr>
+      <w:r>
+        <w:rPr/>
+        <w:t>Antes de cada entrega, será verificado se:</w:t>
       </w:r>
     </w:p>
     <w:p>
@@ -13967,7 +13020,7 @@
       </w:pPr>
       <w:r>
         <w:rPr/>
-        <w:t xml:space="preserve">validação dos campos obrigatórios; </w:t>
+        <w:t xml:space="preserve">Todos os fluxos críticos foram executados com sucesso. </w:t>
       </w:r>
     </w:p>
     <w:p>
@@ -13987,7 +13040,7 @@
       </w:pPr>
       <w:r>
         <w:rPr/>
-        <w:t xml:space="preserve">regras de negócio; </w:t>
+        <w:t xml:space="preserve">Não existem defeitos críticos ou bloqueantes em aberto. </w:t>
       </w:r>
     </w:p>
     <w:p>
@@ -14007,7 +13060,7 @@
       </w:pPr>
       <w:r>
         <w:rPr/>
-        <w:t xml:space="preserve">máscaras; </w:t>
+        <w:t xml:space="preserve">Casos extremos (edge cases) foram validados. </w:t>
       </w:r>
     </w:p>
     <w:p>
@@ -14021,25 +13074,13 @@
           <w:tab w:val="clear" w:pos="720"/>
           <w:tab w:val="left" w:pos="0" w:leader="none"/>
         </w:tabs>
+        <w:spacing w:before="0" w:after="0"/>
         <w:ind w:hanging="283" w:left="709"/>
         <w:rPr/>
       </w:pPr>
       <w:r>
         <w:rPr/>
-        <w:t xml:space="preserve">validação de valores. </w:t>
-      </w:r>
-    </w:p>
-    <w:p>
-      <w:pPr>
-        <w:pStyle w:val="BodyText"/>
-        <w:spacing w:before="0" w:after="200"/>
-        <w:rPr/>
-      </w:pPr>
-      <w:r>
-        <w:rPr>
-          <w:rStyle w:val="Strong"/>
-        </w:rPr>
-        <w:t>Testes de Integração</w:t>
+        <w:t xml:space="preserve">As regras de negócio foram verificadas. </w:t>
       </w:r>
     </w:p>
     <w:p>
@@ -14047,7 +13088,7 @@
         <w:pStyle w:val="BodyText"/>
         <w:numPr>
           <w:ilvl w:val="0"/>
-          <w:numId w:val="47"/>
+          <w:numId w:val="46"/>
         </w:numPr>
         <w:tabs>
           <w:tab w:val="clear" w:pos="720"/>
@@ -14059,7 +13100,7 @@
       </w:pPr>
       <w:r>
         <w:rPr/>
-        <w:t xml:space="preserve">formulário + estado da aplicação; </w:t>
+        <w:t xml:space="preserve">A aplicação funciona nos navegadores suportados. </w:t>
       </w:r>
     </w:p>
     <w:p>
@@ -14067,7 +13108,7 @@
         <w:pStyle w:val="BodyText"/>
         <w:numPr>
           <w:ilvl w:val="0"/>
-          <w:numId w:val="47"/>
+          <w:numId w:val="46"/>
         </w:numPr>
         <w:tabs>
           <w:tab w:val="clear" w:pos="720"/>
@@ -14079,7 +13120,7 @@
       </w:pPr>
       <w:r>
         <w:rPr/>
-        <w:t xml:space="preserve">atualização da listagem após cadastro; </w:t>
+        <w:t xml:space="preserve">A responsividade atende aos dispositivos definidos. </w:t>
       </w:r>
     </w:p>
     <w:p>
@@ -14087,31 +13128,19 @@
         <w:pStyle w:val="BodyText"/>
         <w:numPr>
           <w:ilvl w:val="0"/>
-          <w:numId w:val="47"/>
+          <w:numId w:val="46"/>
         </w:numPr>
         <w:tabs>
           <w:tab w:val="clear" w:pos="720"/>
           <w:tab w:val="left" w:pos="0" w:leader="none"/>
         </w:tabs>
+        <w:spacing w:before="0" w:after="0"/>
         <w:ind w:hanging="283" w:left="709"/>
         <w:rPr/>
       </w:pPr>
       <w:r>
         <w:rPr/>
-        <w:t xml:space="preserve">navegação entre telas. </w:t>
-      </w:r>
-    </w:p>
-    <w:p>
-      <w:pPr>
-        <w:pStyle w:val="BodyText"/>
-        <w:spacing w:before="0" w:after="200"/>
-        <w:rPr/>
-      </w:pPr>
-      <w:r>
-        <w:rPr>
-          <w:rStyle w:val="Strong"/>
-        </w:rPr>
-        <w:t>Testes E2E</w:t>
+        <w:t xml:space="preserve">Os requisitos de acessibilidade foram avaliados. </w:t>
       </w:r>
     </w:p>
     <w:p>
@@ -14119,7 +13148,7 @@
         <w:pStyle w:val="BodyText"/>
         <w:numPr>
           <w:ilvl w:val="0"/>
-          <w:numId w:val="48"/>
+          <w:numId w:val="46"/>
         </w:numPr>
         <w:tabs>
           <w:tab w:val="clear" w:pos="720"/>
@@ -14131,7 +13160,7 @@
       </w:pPr>
       <w:r>
         <w:rPr/>
-        <w:t xml:space="preserve">cadastro com sucesso; </w:t>
+        <w:t xml:space="preserve">A regressão foi concluída sem falhas críticas. </w:t>
       </w:r>
     </w:p>
     <w:p>
@@ -14139,800 +13168,7 @@
         <w:pStyle w:val="BodyText"/>
         <w:numPr>
           <w:ilvl w:val="0"/>
-          <w:numId w:val="48"/>
-        </w:numPr>
-        <w:tabs>
-          <w:tab w:val="clear" w:pos="720"/>
-          <w:tab w:val="left" w:pos="0" w:leader="none"/>
-        </w:tabs>
-        <w:spacing w:before="0" w:after="0"/>
-        <w:ind w:hanging="283" w:left="709"/>
-        <w:rPr/>
-      </w:pPr>
-      <w:r>
-        <w:rPr/>
-        <w:t xml:space="preserve">cadastro inválido; </w:t>
-      </w:r>
-    </w:p>
-    <w:p>
-      <w:pPr>
-        <w:pStyle w:val="BodyText"/>
-        <w:numPr>
-          <w:ilvl w:val="0"/>
-          <w:numId w:val="48"/>
-        </w:numPr>
-        <w:tabs>
-          <w:tab w:val="clear" w:pos="720"/>
-          <w:tab w:val="left" w:pos="0" w:leader="none"/>
-        </w:tabs>
-        <w:ind w:hanging="283" w:left="709"/>
-        <w:rPr/>
-      </w:pPr>
-      <w:r>
-        <w:rPr/>
-        <w:t xml:space="preserve">cadastro com campos obrigatórios ausentes. </w:t>
-      </w:r>
-    </w:p>
-    <w:p>
-      <w:pPr>
-        <w:pStyle w:val="Linhahorizontaluser"/>
-        <w:spacing w:before="0" w:after="200"/>
-        <w:rPr/>
-      </w:pPr>
-      <w:r>
-        <w:rPr/>
-      </w:r>
-    </w:p>
-    <w:p>
-      <w:pPr>
-        <w:pStyle w:val="Heading3"/>
-        <w:spacing w:before="0" w:after="200"/>
-        <w:rPr/>
-      </w:pPr>
-      <w:r>
-        <w:rPr/>
-        <w:t>Busca de Imóveis</w:t>
-      </w:r>
-    </w:p>
-    <w:p>
-      <w:pPr>
-        <w:pStyle w:val="BodyText"/>
-        <w:spacing w:before="0" w:after="200"/>
-        <w:rPr/>
-      </w:pPr>
-      <w:r>
-        <w:rPr>
-          <w:rStyle w:val="Strong"/>
-        </w:rPr>
-        <w:t>Testes Unitários</w:t>
-      </w:r>
-    </w:p>
-    <w:p>
-      <w:pPr>
-        <w:pStyle w:val="BodyText"/>
-        <w:numPr>
-          <w:ilvl w:val="0"/>
-          <w:numId w:val="49"/>
-        </w:numPr>
-        <w:tabs>
-          <w:tab w:val="clear" w:pos="720"/>
-          <w:tab w:val="left" w:pos="0" w:leader="none"/>
-        </w:tabs>
-        <w:spacing w:before="0" w:after="0"/>
-        <w:ind w:hanging="283" w:left="709"/>
-        <w:rPr/>
-      </w:pPr>
-      <w:r>
-        <w:rPr/>
-        <w:t xml:space="preserve">algoritmo de busca; </w:t>
-      </w:r>
-    </w:p>
-    <w:p>
-      <w:pPr>
-        <w:pStyle w:val="BodyText"/>
-        <w:numPr>
-          <w:ilvl w:val="0"/>
-          <w:numId w:val="49"/>
-        </w:numPr>
-        <w:tabs>
-          <w:tab w:val="clear" w:pos="720"/>
-          <w:tab w:val="left" w:pos="0" w:leader="none"/>
-        </w:tabs>
-        <w:spacing w:before="0" w:after="0"/>
-        <w:ind w:hanging="283" w:left="709"/>
-        <w:rPr/>
-      </w:pPr>
-      <w:r>
-        <w:rPr/>
-        <w:t xml:space="preserve">filtros de texto; </w:t>
-      </w:r>
-    </w:p>
-    <w:p>
-      <w:pPr>
-        <w:pStyle w:val="BodyText"/>
-        <w:numPr>
-          <w:ilvl w:val="0"/>
-          <w:numId w:val="49"/>
-        </w:numPr>
-        <w:tabs>
-          <w:tab w:val="clear" w:pos="720"/>
-          <w:tab w:val="left" w:pos="0" w:leader="none"/>
-        </w:tabs>
-        <w:ind w:hanging="283" w:left="709"/>
-        <w:rPr/>
-      </w:pPr>
-      <w:r>
-        <w:rPr/>
-        <w:t xml:space="preserve">normalização de caracteres. </w:t>
-      </w:r>
-    </w:p>
-    <w:p>
-      <w:pPr>
-        <w:pStyle w:val="BodyText"/>
-        <w:spacing w:before="0" w:after="200"/>
-        <w:rPr/>
-      </w:pPr>
-      <w:r>
-        <w:rPr>
-          <w:rStyle w:val="Strong"/>
-        </w:rPr>
-        <w:t>Testes de Integração</w:t>
-      </w:r>
-    </w:p>
-    <w:p>
-      <w:pPr>
-        <w:pStyle w:val="BodyText"/>
-        <w:numPr>
-          <w:ilvl w:val="0"/>
-          <w:numId w:val="50"/>
-        </w:numPr>
-        <w:tabs>
-          <w:tab w:val="clear" w:pos="720"/>
-          <w:tab w:val="left" w:pos="0" w:leader="none"/>
-        </w:tabs>
-        <w:spacing w:before="0" w:after="0"/>
-        <w:ind w:hanging="283" w:left="709"/>
-        <w:rPr/>
-      </w:pPr>
-      <w:r>
-        <w:rPr/>
-        <w:t xml:space="preserve">busca integrada à listagem; </w:t>
-      </w:r>
-    </w:p>
-    <w:p>
-      <w:pPr>
-        <w:pStyle w:val="BodyText"/>
-        <w:numPr>
-          <w:ilvl w:val="0"/>
-          <w:numId w:val="50"/>
-        </w:numPr>
-        <w:tabs>
-          <w:tab w:val="clear" w:pos="720"/>
-          <w:tab w:val="left" w:pos="0" w:leader="none"/>
-        </w:tabs>
-        <w:ind w:hanging="283" w:left="709"/>
-        <w:rPr/>
-      </w:pPr>
-      <w:r>
-        <w:rPr/>
-        <w:t xml:space="preserve">atualização dos resultados. </w:t>
-      </w:r>
-    </w:p>
-    <w:p>
-      <w:pPr>
-        <w:pStyle w:val="BodyText"/>
-        <w:spacing w:before="0" w:after="200"/>
-        <w:rPr/>
-      </w:pPr>
-      <w:r>
-        <w:rPr>
-          <w:rStyle w:val="Strong"/>
-        </w:rPr>
-        <w:t>Testes E2E</w:t>
-      </w:r>
-    </w:p>
-    <w:p>
-      <w:pPr>
-        <w:pStyle w:val="BodyText"/>
-        <w:numPr>
-          <w:ilvl w:val="0"/>
-          <w:numId w:val="51"/>
-        </w:numPr>
-        <w:tabs>
-          <w:tab w:val="clear" w:pos="720"/>
-          <w:tab w:val="left" w:pos="0" w:leader="none"/>
-        </w:tabs>
-        <w:spacing w:before="0" w:after="0"/>
-        <w:ind w:hanging="283" w:left="709"/>
-        <w:rPr/>
-      </w:pPr>
-      <w:r>
-        <w:rPr/>
-        <w:t xml:space="preserve">pesquisar imóvel existente; </w:t>
-      </w:r>
-    </w:p>
-    <w:p>
-      <w:pPr>
-        <w:pStyle w:val="BodyText"/>
-        <w:numPr>
-          <w:ilvl w:val="0"/>
-          <w:numId w:val="51"/>
-        </w:numPr>
-        <w:tabs>
-          <w:tab w:val="clear" w:pos="720"/>
-          <w:tab w:val="left" w:pos="0" w:leader="none"/>
-        </w:tabs>
-        <w:ind w:hanging="283" w:left="709"/>
-        <w:rPr/>
-      </w:pPr>
-      <w:r>
-        <w:rPr/>
-        <w:t xml:space="preserve">pesquisar imóvel inexistente. </w:t>
-      </w:r>
-    </w:p>
-    <w:p>
-      <w:pPr>
-        <w:pStyle w:val="Linhahorizontaluser"/>
-        <w:spacing w:before="0" w:after="200"/>
-        <w:rPr/>
-      </w:pPr>
-      <w:r>
-        <w:rPr/>
-      </w:r>
-    </w:p>
-    <w:p>
-      <w:pPr>
-        <w:pStyle w:val="Heading3"/>
-        <w:spacing w:before="0" w:after="200"/>
-        <w:rPr/>
-      </w:pPr>
-      <w:r>
-        <w:rPr/>
-        <w:t>Listagem de Imóveis</w:t>
-      </w:r>
-    </w:p>
-    <w:p>
-      <w:pPr>
-        <w:pStyle w:val="BodyText"/>
-        <w:spacing w:before="0" w:after="200"/>
-        <w:rPr/>
-      </w:pPr>
-      <w:r>
-        <w:rPr>
-          <w:rStyle w:val="Strong"/>
-        </w:rPr>
-        <w:t>Testes Unitários</w:t>
-      </w:r>
-    </w:p>
-    <w:p>
-      <w:pPr>
-        <w:pStyle w:val="BodyText"/>
-        <w:numPr>
-          <w:ilvl w:val="0"/>
-          <w:numId w:val="52"/>
-        </w:numPr>
-        <w:tabs>
-          <w:tab w:val="clear" w:pos="720"/>
-          <w:tab w:val="left" w:pos="0" w:leader="none"/>
-        </w:tabs>
-        <w:spacing w:before="0" w:after="0"/>
-        <w:ind w:hanging="283" w:left="709"/>
-        <w:rPr/>
-      </w:pPr>
-      <w:r>
-        <w:rPr/>
-        <w:t xml:space="preserve">renderização dos cards; </w:t>
-      </w:r>
-    </w:p>
-    <w:p>
-      <w:pPr>
-        <w:pStyle w:val="BodyText"/>
-        <w:numPr>
-          <w:ilvl w:val="0"/>
-          <w:numId w:val="52"/>
-        </w:numPr>
-        <w:tabs>
-          <w:tab w:val="clear" w:pos="720"/>
-          <w:tab w:val="left" w:pos="0" w:leader="none"/>
-        </w:tabs>
-        <w:ind w:hanging="283" w:left="709"/>
-        <w:rPr/>
-      </w:pPr>
-      <w:r>
-        <w:rPr/>
-        <w:t xml:space="preserve">formatação de dados. </w:t>
-      </w:r>
-    </w:p>
-    <w:p>
-      <w:pPr>
-        <w:pStyle w:val="BodyText"/>
-        <w:spacing w:before="0" w:after="200"/>
-        <w:rPr/>
-      </w:pPr>
-      <w:r>
-        <w:rPr>
-          <w:rStyle w:val="Strong"/>
-        </w:rPr>
-        <w:t>Testes de Integração</w:t>
-      </w:r>
-    </w:p>
-    <w:p>
-      <w:pPr>
-        <w:pStyle w:val="BodyText"/>
-        <w:numPr>
-          <w:ilvl w:val="0"/>
-          <w:numId w:val="53"/>
-        </w:numPr>
-        <w:tabs>
-          <w:tab w:val="clear" w:pos="720"/>
-          <w:tab w:val="left" w:pos="0" w:leader="none"/>
-        </w:tabs>
-        <w:spacing w:before="0" w:after="0"/>
-        <w:ind w:hanging="283" w:left="709"/>
-        <w:rPr/>
-      </w:pPr>
-      <w:r>
-        <w:rPr/>
-        <w:t xml:space="preserve">carregamento dos dados mockados; </w:t>
-      </w:r>
-    </w:p>
-    <w:p>
-      <w:pPr>
-        <w:pStyle w:val="BodyText"/>
-        <w:numPr>
-          <w:ilvl w:val="0"/>
-          <w:numId w:val="53"/>
-        </w:numPr>
-        <w:tabs>
-          <w:tab w:val="clear" w:pos="720"/>
-          <w:tab w:val="left" w:pos="0" w:leader="none"/>
-        </w:tabs>
-        <w:ind w:hanging="283" w:left="709"/>
-        <w:rPr/>
-      </w:pPr>
-      <w:r>
-        <w:rPr/>
-        <w:t xml:space="preserve">atualização após cadastro. </w:t>
-      </w:r>
-    </w:p>
-    <w:p>
-      <w:pPr>
-        <w:pStyle w:val="BodyText"/>
-        <w:spacing w:before="0" w:after="200"/>
-        <w:rPr/>
-      </w:pPr>
-      <w:r>
-        <w:rPr>
-          <w:rStyle w:val="Strong"/>
-        </w:rPr>
-        <w:t>Testes E2E</w:t>
-      </w:r>
-    </w:p>
-    <w:p>
-      <w:pPr>
-        <w:pStyle w:val="BodyText"/>
-        <w:numPr>
-          <w:ilvl w:val="0"/>
-          <w:numId w:val="54"/>
-        </w:numPr>
-        <w:tabs>
-          <w:tab w:val="clear" w:pos="720"/>
-          <w:tab w:val="left" w:pos="0" w:leader="none"/>
-        </w:tabs>
-        <w:spacing w:before="0" w:after="0"/>
-        <w:ind w:hanging="283" w:left="709"/>
-        <w:rPr/>
-      </w:pPr>
-      <w:r>
-        <w:rPr/>
-        <w:t xml:space="preserve">visualizar todos os imóveis; </w:t>
-      </w:r>
-    </w:p>
-    <w:p>
-      <w:pPr>
-        <w:pStyle w:val="BodyText"/>
-        <w:numPr>
-          <w:ilvl w:val="0"/>
-          <w:numId w:val="54"/>
-        </w:numPr>
-        <w:tabs>
-          <w:tab w:val="clear" w:pos="720"/>
-          <w:tab w:val="left" w:pos="0" w:leader="none"/>
-        </w:tabs>
-        <w:ind w:hanging="283" w:left="709"/>
-        <w:rPr/>
-      </w:pPr>
-      <w:r>
-        <w:rPr/>
-        <w:t xml:space="preserve">validar informações apresentadas. </w:t>
-      </w:r>
-    </w:p>
-    <w:p>
-      <w:pPr>
-        <w:pStyle w:val="Linhahorizontaluser"/>
-        <w:spacing w:before="0" w:after="200"/>
-        <w:rPr/>
-      </w:pPr>
-      <w:r>
-        <w:rPr/>
-      </w:r>
-    </w:p>
-    <w:p>
-      <w:pPr>
-        <w:pStyle w:val="Heading3"/>
-        <w:spacing w:before="0" w:after="200"/>
-        <w:rPr/>
-      </w:pPr>
-      <w:r>
-        <w:rPr/>
-        <w:t>Filtros</w:t>
-      </w:r>
-    </w:p>
-    <w:p>
-      <w:pPr>
-        <w:pStyle w:val="BodyText"/>
-        <w:spacing w:before="0" w:after="200"/>
-        <w:rPr/>
-      </w:pPr>
-      <w:r>
-        <w:rPr>
-          <w:rStyle w:val="Strong"/>
-        </w:rPr>
-        <w:t>Testes Unitários</w:t>
-      </w:r>
-    </w:p>
-    <w:p>
-      <w:pPr>
-        <w:pStyle w:val="BodyText"/>
-        <w:numPr>
-          <w:ilvl w:val="0"/>
-          <w:numId w:val="55"/>
-        </w:numPr>
-        <w:tabs>
-          <w:tab w:val="clear" w:pos="720"/>
-          <w:tab w:val="left" w:pos="0" w:leader="none"/>
-        </w:tabs>
-        <w:spacing w:before="0" w:after="0"/>
-        <w:ind w:hanging="283" w:left="709"/>
-        <w:rPr/>
-      </w:pPr>
-      <w:r>
-        <w:rPr/>
-        <w:t xml:space="preserve">regras dos filtros; </w:t>
-      </w:r>
-    </w:p>
-    <w:p>
-      <w:pPr>
-        <w:pStyle w:val="BodyText"/>
-        <w:numPr>
-          <w:ilvl w:val="0"/>
-          <w:numId w:val="55"/>
-        </w:numPr>
-        <w:tabs>
-          <w:tab w:val="clear" w:pos="720"/>
-          <w:tab w:val="left" w:pos="0" w:leader="none"/>
-        </w:tabs>
-        <w:ind w:hanging="283" w:left="709"/>
-        <w:rPr/>
-      </w:pPr>
-      <w:r>
-        <w:rPr/>
-        <w:t xml:space="preserve">combinações válidas. </w:t>
-      </w:r>
-    </w:p>
-    <w:p>
-      <w:pPr>
-        <w:pStyle w:val="BodyText"/>
-        <w:spacing w:before="0" w:after="200"/>
-        <w:rPr/>
-      </w:pPr>
-      <w:r>
-        <w:rPr>
-          <w:rStyle w:val="Strong"/>
-        </w:rPr>
-        <w:t>Testes de Integração</w:t>
-      </w:r>
-    </w:p>
-    <w:p>
-      <w:pPr>
-        <w:pStyle w:val="BodyText"/>
-        <w:numPr>
-          <w:ilvl w:val="0"/>
-          <w:numId w:val="56"/>
-        </w:numPr>
-        <w:tabs>
-          <w:tab w:val="clear" w:pos="720"/>
-          <w:tab w:val="left" w:pos="0" w:leader="none"/>
-        </w:tabs>
-        <w:spacing w:before="0" w:after="0"/>
-        <w:ind w:hanging="283" w:left="709"/>
-        <w:rPr/>
-      </w:pPr>
-      <w:r>
-        <w:rPr/>
-        <w:t xml:space="preserve">filtro + busca; </w:t>
-      </w:r>
-    </w:p>
-    <w:p>
-      <w:pPr>
-        <w:pStyle w:val="BodyText"/>
-        <w:numPr>
-          <w:ilvl w:val="0"/>
-          <w:numId w:val="56"/>
-        </w:numPr>
-        <w:tabs>
-          <w:tab w:val="clear" w:pos="720"/>
-          <w:tab w:val="left" w:pos="0" w:leader="none"/>
-        </w:tabs>
-        <w:ind w:hanging="283" w:left="709"/>
-        <w:rPr/>
-      </w:pPr>
-      <w:r>
-        <w:rPr/>
-        <w:t xml:space="preserve">múltiplos filtros simultaneamente. </w:t>
-      </w:r>
-    </w:p>
-    <w:p>
-      <w:pPr>
-        <w:pStyle w:val="BodyText"/>
-        <w:spacing w:before="0" w:after="200"/>
-        <w:rPr/>
-      </w:pPr>
-      <w:r>
-        <w:rPr>
-          <w:rStyle w:val="Strong"/>
-        </w:rPr>
-        <w:t>Testes E2E</w:t>
-      </w:r>
-    </w:p>
-    <w:p>
-      <w:pPr>
-        <w:pStyle w:val="BodyText"/>
-        <w:numPr>
-          <w:ilvl w:val="0"/>
-          <w:numId w:val="57"/>
-        </w:numPr>
-        <w:tabs>
-          <w:tab w:val="clear" w:pos="720"/>
-          <w:tab w:val="left" w:pos="0" w:leader="none"/>
-        </w:tabs>
-        <w:spacing w:before="0" w:after="0"/>
-        <w:ind w:hanging="283" w:left="709"/>
-        <w:rPr/>
-      </w:pPr>
-      <w:r>
-        <w:rPr/>
-        <w:t xml:space="preserve">aplicar filtros; </w:t>
-      </w:r>
-    </w:p>
-    <w:p>
-      <w:pPr>
-        <w:pStyle w:val="BodyText"/>
-        <w:numPr>
-          <w:ilvl w:val="0"/>
-          <w:numId w:val="57"/>
-        </w:numPr>
-        <w:tabs>
-          <w:tab w:val="clear" w:pos="720"/>
-          <w:tab w:val="left" w:pos="0" w:leader="none"/>
-        </w:tabs>
-        <w:ind w:hanging="283" w:left="709"/>
-        <w:rPr/>
-      </w:pPr>
-      <w:r>
-        <w:rPr/>
-        <w:t xml:space="preserve">limpar filtros. </w:t>
-      </w:r>
-    </w:p>
-    <w:p>
-      <w:pPr>
-        <w:pStyle w:val="Linhahorizontaluser"/>
-        <w:spacing w:before="0" w:after="200"/>
-        <w:rPr/>
-      </w:pPr>
-      <w:r>
-        <w:rPr/>
-      </w:r>
-    </w:p>
-    <w:p>
-      <w:pPr>
-        <w:pStyle w:val="Heading1"/>
-        <w:spacing w:before="0" w:after="200"/>
-        <w:rPr/>
-      </w:pPr>
-      <w:r>
-        <w:rPr/>
-        <w:t>Pilar 3 – Quality Focus</w:t>
-      </w:r>
-    </w:p>
-    <w:p>
-      <w:pPr>
-        <w:pStyle w:val="BodyText"/>
-        <w:spacing w:before="0" w:after="200"/>
-        <w:rPr/>
-      </w:pPr>
-      <w:r>
-        <w:rPr/>
-        <w:t>A qualidade do produto não será avaliada apenas pelo número de testes executados ou pela cobertura de código.</w:t>
-      </w:r>
-    </w:p>
-    <w:p>
-      <w:pPr>
-        <w:pStyle w:val="BodyText"/>
-        <w:spacing w:before="0" w:after="200"/>
-        <w:rPr/>
-      </w:pPr>
-      <w:r>
-        <w:rPr/>
-        <w:t>Antes de cada entrega, será verificado se:</w:t>
-      </w:r>
-    </w:p>
-    <w:p>
-      <w:pPr>
-        <w:pStyle w:val="BodyText"/>
-        <w:numPr>
-          <w:ilvl w:val="0"/>
-          <w:numId w:val="58"/>
-        </w:numPr>
-        <w:tabs>
-          <w:tab w:val="clear" w:pos="720"/>
-          <w:tab w:val="left" w:pos="0" w:leader="none"/>
-        </w:tabs>
-        <w:spacing w:before="0" w:after="0"/>
-        <w:ind w:hanging="283" w:left="709"/>
-        <w:rPr/>
-      </w:pPr>
-      <w:r>
-        <w:rPr/>
-        <w:t xml:space="preserve">Todos os fluxos críticos foram executados com sucesso. </w:t>
-      </w:r>
-    </w:p>
-    <w:p>
-      <w:pPr>
-        <w:pStyle w:val="BodyText"/>
-        <w:numPr>
-          <w:ilvl w:val="0"/>
-          <w:numId w:val="58"/>
-        </w:numPr>
-        <w:tabs>
-          <w:tab w:val="clear" w:pos="720"/>
-          <w:tab w:val="left" w:pos="0" w:leader="none"/>
-        </w:tabs>
-        <w:spacing w:before="0" w:after="0"/>
-        <w:ind w:hanging="283" w:left="709"/>
-        <w:rPr/>
-      </w:pPr>
-      <w:r>
-        <w:rPr/>
-        <w:t xml:space="preserve">Não existem defeitos críticos ou bloqueantes em aberto. </w:t>
-      </w:r>
-    </w:p>
-    <w:p>
-      <w:pPr>
-        <w:pStyle w:val="BodyText"/>
-        <w:numPr>
-          <w:ilvl w:val="0"/>
-          <w:numId w:val="58"/>
-        </w:numPr>
-        <w:tabs>
-          <w:tab w:val="clear" w:pos="720"/>
-          <w:tab w:val="left" w:pos="0" w:leader="none"/>
-        </w:tabs>
-        <w:spacing w:before="0" w:after="0"/>
-        <w:ind w:hanging="283" w:left="709"/>
-        <w:rPr/>
-      </w:pPr>
-      <w:r>
-        <w:rPr/>
-        <w:t xml:space="preserve">Casos extremos (edge cases) foram validados. </w:t>
-      </w:r>
-    </w:p>
-    <w:p>
-      <w:pPr>
-        <w:pStyle w:val="BodyText"/>
-        <w:numPr>
-          <w:ilvl w:val="0"/>
-          <w:numId w:val="58"/>
-        </w:numPr>
-        <w:tabs>
-          <w:tab w:val="clear" w:pos="720"/>
-          <w:tab w:val="left" w:pos="0" w:leader="none"/>
-        </w:tabs>
-        <w:spacing w:before="0" w:after="0"/>
-        <w:ind w:hanging="283" w:left="709"/>
-        <w:rPr/>
-      </w:pPr>
-      <w:r>
-        <w:rPr/>
-        <w:t xml:space="preserve">As regras de negócio foram verificadas. </w:t>
-      </w:r>
-    </w:p>
-    <w:p>
-      <w:pPr>
-        <w:pStyle w:val="BodyText"/>
-        <w:numPr>
-          <w:ilvl w:val="0"/>
-          <w:numId w:val="58"/>
-        </w:numPr>
-        <w:tabs>
-          <w:tab w:val="clear" w:pos="720"/>
-          <w:tab w:val="left" w:pos="0" w:leader="none"/>
-        </w:tabs>
-        <w:spacing w:before="0" w:after="0"/>
-        <w:ind w:hanging="283" w:left="709"/>
-        <w:rPr/>
-      </w:pPr>
-      <w:r>
-        <w:rPr/>
-        <w:t xml:space="preserve">A aplicação funciona nos navegadores suportados. </w:t>
-      </w:r>
-    </w:p>
-    <w:p>
-      <w:pPr>
-        <w:pStyle w:val="BodyText"/>
-        <w:numPr>
-          <w:ilvl w:val="0"/>
-          <w:numId w:val="58"/>
-        </w:numPr>
-        <w:tabs>
-          <w:tab w:val="clear" w:pos="720"/>
-          <w:tab w:val="left" w:pos="0" w:leader="none"/>
-        </w:tabs>
-        <w:spacing w:before="0" w:after="0"/>
-        <w:ind w:hanging="283" w:left="709"/>
-        <w:rPr/>
-      </w:pPr>
-      <w:r>
-        <w:rPr/>
-        <w:t xml:space="preserve">A responsividade atende aos dispositivos definidos. </w:t>
-      </w:r>
-    </w:p>
-    <w:p>
-      <w:pPr>
-        <w:pStyle w:val="BodyText"/>
-        <w:numPr>
-          <w:ilvl w:val="0"/>
-          <w:numId w:val="58"/>
-        </w:numPr>
-        <w:tabs>
-          <w:tab w:val="clear" w:pos="720"/>
-          <w:tab w:val="left" w:pos="0" w:leader="none"/>
-        </w:tabs>
-        <w:spacing w:before="0" w:after="0"/>
-        <w:ind w:hanging="283" w:left="709"/>
-        <w:rPr/>
-      </w:pPr>
-      <w:r>
-        <w:rPr/>
-        <w:t xml:space="preserve">Os requisitos de acessibilidade foram avaliados. </w:t>
-      </w:r>
-    </w:p>
-    <w:p>
-      <w:pPr>
-        <w:pStyle w:val="BodyText"/>
-        <w:numPr>
-          <w:ilvl w:val="0"/>
-          <w:numId w:val="58"/>
-        </w:numPr>
-        <w:tabs>
-          <w:tab w:val="clear" w:pos="720"/>
-          <w:tab w:val="left" w:pos="0" w:leader="none"/>
-        </w:tabs>
-        <w:spacing w:before="0" w:after="0"/>
-        <w:ind w:hanging="283" w:left="709"/>
-        <w:rPr/>
-      </w:pPr>
-      <w:r>
-        <w:rPr/>
-        <w:t xml:space="preserve">A regressão foi concluída sem falhas críticas. </w:t>
-      </w:r>
-    </w:p>
-    <w:p>
-      <w:pPr>
-        <w:pStyle w:val="BodyText"/>
-        <w:numPr>
-          <w:ilvl w:val="0"/>
-          <w:numId w:val="58"/>
+          <w:numId w:val="46"/>
         </w:numPr>
         <w:tabs>
           <w:tab w:val="clear" w:pos="720"/>
@@ -23215,1650 +21451,6 @@
   <w:abstractNum w:abstractNumId="47">
     <w:lvl w:ilvl="0">
       <w:start w:val="1"/>
-      <w:numFmt w:val="bullet"/>
-      <w:lvlText w:val=""/>
-      <w:lvlJc w:val="left"/>
-      <w:pPr>
-        <w:tabs>
-          <w:tab w:val="num" w:pos="709"/>
-        </w:tabs>
-        <w:ind w:left="709" w:hanging="283"/>
-      </w:pPr>
-      <w:rPr>
-        <w:rFonts w:ascii="Symbol" w:hAnsi="Symbol" w:cs="Symbol" w:hint="default"/>
-      </w:rPr>
-    </w:lvl>
-    <w:lvl w:ilvl="1">
-      <w:start w:val="1"/>
-      <w:numFmt w:val="bullet"/>
-      <w:lvlText w:val=""/>
-      <w:lvlJc w:val="left"/>
-      <w:pPr>
-        <w:tabs>
-          <w:tab w:val="num" w:pos="1418"/>
-        </w:tabs>
-        <w:ind w:left="1418" w:hanging="283"/>
-      </w:pPr>
-      <w:rPr>
-        <w:rFonts w:ascii="Symbol" w:hAnsi="Symbol" w:cs="Symbol" w:hint="default"/>
-      </w:rPr>
-    </w:lvl>
-    <w:lvl w:ilvl="2">
-      <w:start w:val="1"/>
-      <w:numFmt w:val="bullet"/>
-      <w:lvlText w:val=""/>
-      <w:lvlJc w:val="left"/>
-      <w:pPr>
-        <w:tabs>
-          <w:tab w:val="num" w:pos="2127"/>
-        </w:tabs>
-        <w:ind w:left="2127" w:hanging="283"/>
-      </w:pPr>
-      <w:rPr>
-        <w:rFonts w:ascii="Symbol" w:hAnsi="Symbol" w:cs="Symbol" w:hint="default"/>
-      </w:rPr>
-    </w:lvl>
-    <w:lvl w:ilvl="3">
-      <w:start w:val="1"/>
-      <w:numFmt w:val="bullet"/>
-      <w:lvlText w:val=""/>
-      <w:lvlJc w:val="left"/>
-      <w:pPr>
-        <w:tabs>
-          <w:tab w:val="num" w:pos="2836"/>
-        </w:tabs>
-        <w:ind w:left="2836" w:hanging="283"/>
-      </w:pPr>
-      <w:rPr>
-        <w:rFonts w:ascii="Symbol" w:hAnsi="Symbol" w:cs="Symbol" w:hint="default"/>
-      </w:rPr>
-    </w:lvl>
-    <w:lvl w:ilvl="4">
-      <w:start w:val="1"/>
-      <w:numFmt w:val="bullet"/>
-      <w:lvlText w:val=""/>
-      <w:lvlJc w:val="left"/>
-      <w:pPr>
-        <w:tabs>
-          <w:tab w:val="num" w:pos="3545"/>
-        </w:tabs>
-        <w:ind w:left="3545" w:hanging="283"/>
-      </w:pPr>
-      <w:rPr>
-        <w:rFonts w:ascii="Symbol" w:hAnsi="Symbol" w:cs="Symbol" w:hint="default"/>
-      </w:rPr>
-    </w:lvl>
-    <w:lvl w:ilvl="5">
-      <w:start w:val="1"/>
-      <w:numFmt w:val="bullet"/>
-      <w:lvlText w:val=""/>
-      <w:lvlJc w:val="left"/>
-      <w:pPr>
-        <w:tabs>
-          <w:tab w:val="num" w:pos="4254"/>
-        </w:tabs>
-        <w:ind w:left="4254" w:hanging="283"/>
-      </w:pPr>
-      <w:rPr>
-        <w:rFonts w:ascii="Symbol" w:hAnsi="Symbol" w:cs="Symbol" w:hint="default"/>
-      </w:rPr>
-    </w:lvl>
-    <w:lvl w:ilvl="6">
-      <w:start w:val="1"/>
-      <w:numFmt w:val="bullet"/>
-      <w:lvlText w:val=""/>
-      <w:lvlJc w:val="left"/>
-      <w:pPr>
-        <w:tabs>
-          <w:tab w:val="num" w:pos="4963"/>
-        </w:tabs>
-        <w:ind w:left="4963" w:hanging="283"/>
-      </w:pPr>
-      <w:rPr>
-        <w:rFonts w:ascii="Symbol" w:hAnsi="Symbol" w:cs="Symbol" w:hint="default"/>
-      </w:rPr>
-    </w:lvl>
-    <w:lvl w:ilvl="7">
-      <w:start w:val="1"/>
-      <w:numFmt w:val="bullet"/>
-      <w:lvlText w:val=""/>
-      <w:lvlJc w:val="left"/>
-      <w:pPr>
-        <w:tabs>
-          <w:tab w:val="num" w:pos="5672"/>
-        </w:tabs>
-        <w:ind w:left="5672" w:hanging="283"/>
-      </w:pPr>
-      <w:rPr>
-        <w:rFonts w:ascii="Symbol" w:hAnsi="Symbol" w:cs="Symbol" w:hint="default"/>
-      </w:rPr>
-    </w:lvl>
-    <w:lvl w:ilvl="8">
-      <w:start w:val="1"/>
-      <w:numFmt w:val="bullet"/>
-      <w:lvlText w:val=""/>
-      <w:lvlJc w:val="left"/>
-      <w:pPr>
-        <w:tabs>
-          <w:tab w:val="num" w:pos="6381"/>
-        </w:tabs>
-        <w:ind w:left="6381" w:hanging="283"/>
-      </w:pPr>
-      <w:rPr>
-        <w:rFonts w:ascii="Symbol" w:hAnsi="Symbol" w:cs="Symbol" w:hint="default"/>
-      </w:rPr>
-    </w:lvl>
-  </w:abstractNum>
-  <w:abstractNum w:abstractNumId="48">
-    <w:lvl w:ilvl="0">
-      <w:start w:val="1"/>
-      <w:numFmt w:val="bullet"/>
-      <w:lvlText w:val=""/>
-      <w:lvlJc w:val="left"/>
-      <w:pPr>
-        <w:tabs>
-          <w:tab w:val="num" w:pos="709"/>
-        </w:tabs>
-        <w:ind w:left="709" w:hanging="283"/>
-      </w:pPr>
-      <w:rPr>
-        <w:rFonts w:ascii="Symbol" w:hAnsi="Symbol" w:cs="Symbol" w:hint="default"/>
-      </w:rPr>
-    </w:lvl>
-    <w:lvl w:ilvl="1">
-      <w:start w:val="1"/>
-      <w:numFmt w:val="bullet"/>
-      <w:lvlText w:val=""/>
-      <w:lvlJc w:val="left"/>
-      <w:pPr>
-        <w:tabs>
-          <w:tab w:val="num" w:pos="1418"/>
-        </w:tabs>
-        <w:ind w:left="1418" w:hanging="283"/>
-      </w:pPr>
-      <w:rPr>
-        <w:rFonts w:ascii="Symbol" w:hAnsi="Symbol" w:cs="Symbol" w:hint="default"/>
-      </w:rPr>
-    </w:lvl>
-    <w:lvl w:ilvl="2">
-      <w:start w:val="1"/>
-      <w:numFmt w:val="bullet"/>
-      <w:lvlText w:val=""/>
-      <w:lvlJc w:val="left"/>
-      <w:pPr>
-        <w:tabs>
-          <w:tab w:val="num" w:pos="2127"/>
-        </w:tabs>
-        <w:ind w:left="2127" w:hanging="283"/>
-      </w:pPr>
-      <w:rPr>
-        <w:rFonts w:ascii="Symbol" w:hAnsi="Symbol" w:cs="Symbol" w:hint="default"/>
-      </w:rPr>
-    </w:lvl>
-    <w:lvl w:ilvl="3">
-      <w:start w:val="1"/>
-      <w:numFmt w:val="bullet"/>
-      <w:lvlText w:val=""/>
-      <w:lvlJc w:val="left"/>
-      <w:pPr>
-        <w:tabs>
-          <w:tab w:val="num" w:pos="2836"/>
-        </w:tabs>
-        <w:ind w:left="2836" w:hanging="283"/>
-      </w:pPr>
-      <w:rPr>
-        <w:rFonts w:ascii="Symbol" w:hAnsi="Symbol" w:cs="Symbol" w:hint="default"/>
-      </w:rPr>
-    </w:lvl>
-    <w:lvl w:ilvl="4">
-      <w:start w:val="1"/>
-      <w:numFmt w:val="bullet"/>
-      <w:lvlText w:val=""/>
-      <w:lvlJc w:val="left"/>
-      <w:pPr>
-        <w:tabs>
-          <w:tab w:val="num" w:pos="3545"/>
-        </w:tabs>
-        <w:ind w:left="3545" w:hanging="283"/>
-      </w:pPr>
-      <w:rPr>
-        <w:rFonts w:ascii="Symbol" w:hAnsi="Symbol" w:cs="Symbol" w:hint="default"/>
-      </w:rPr>
-    </w:lvl>
-    <w:lvl w:ilvl="5">
-      <w:start w:val="1"/>
-      <w:numFmt w:val="bullet"/>
-      <w:lvlText w:val=""/>
-      <w:lvlJc w:val="left"/>
-      <w:pPr>
-        <w:tabs>
-          <w:tab w:val="num" w:pos="4254"/>
-        </w:tabs>
-        <w:ind w:left="4254" w:hanging="283"/>
-      </w:pPr>
-      <w:rPr>
-        <w:rFonts w:ascii="Symbol" w:hAnsi="Symbol" w:cs="Symbol" w:hint="default"/>
-      </w:rPr>
-    </w:lvl>
-    <w:lvl w:ilvl="6">
-      <w:start w:val="1"/>
-      <w:numFmt w:val="bullet"/>
-      <w:lvlText w:val=""/>
-      <w:lvlJc w:val="left"/>
-      <w:pPr>
-        <w:tabs>
-          <w:tab w:val="num" w:pos="4963"/>
-        </w:tabs>
-        <w:ind w:left="4963" w:hanging="283"/>
-      </w:pPr>
-      <w:rPr>
-        <w:rFonts w:ascii="Symbol" w:hAnsi="Symbol" w:cs="Symbol" w:hint="default"/>
-      </w:rPr>
-    </w:lvl>
-    <w:lvl w:ilvl="7">
-      <w:start w:val="1"/>
-      <w:numFmt w:val="bullet"/>
-      <w:lvlText w:val=""/>
-      <w:lvlJc w:val="left"/>
-      <w:pPr>
-        <w:tabs>
-          <w:tab w:val="num" w:pos="5672"/>
-        </w:tabs>
-        <w:ind w:left="5672" w:hanging="283"/>
-      </w:pPr>
-      <w:rPr>
-        <w:rFonts w:ascii="Symbol" w:hAnsi="Symbol" w:cs="Symbol" w:hint="default"/>
-      </w:rPr>
-    </w:lvl>
-    <w:lvl w:ilvl="8">
-      <w:start w:val="1"/>
-      <w:numFmt w:val="bullet"/>
-      <w:lvlText w:val=""/>
-      <w:lvlJc w:val="left"/>
-      <w:pPr>
-        <w:tabs>
-          <w:tab w:val="num" w:pos="6381"/>
-        </w:tabs>
-        <w:ind w:left="6381" w:hanging="283"/>
-      </w:pPr>
-      <w:rPr>
-        <w:rFonts w:ascii="Symbol" w:hAnsi="Symbol" w:cs="Symbol" w:hint="default"/>
-      </w:rPr>
-    </w:lvl>
-  </w:abstractNum>
-  <w:abstractNum w:abstractNumId="49">
-    <w:lvl w:ilvl="0">
-      <w:start w:val="1"/>
-      <w:numFmt w:val="bullet"/>
-      <w:lvlText w:val=""/>
-      <w:lvlJc w:val="left"/>
-      <w:pPr>
-        <w:tabs>
-          <w:tab w:val="num" w:pos="709"/>
-        </w:tabs>
-        <w:ind w:left="709" w:hanging="283"/>
-      </w:pPr>
-      <w:rPr>
-        <w:rFonts w:ascii="Symbol" w:hAnsi="Symbol" w:cs="Symbol" w:hint="default"/>
-      </w:rPr>
-    </w:lvl>
-    <w:lvl w:ilvl="1">
-      <w:start w:val="1"/>
-      <w:numFmt w:val="bullet"/>
-      <w:lvlText w:val=""/>
-      <w:lvlJc w:val="left"/>
-      <w:pPr>
-        <w:tabs>
-          <w:tab w:val="num" w:pos="1418"/>
-        </w:tabs>
-        <w:ind w:left="1418" w:hanging="283"/>
-      </w:pPr>
-      <w:rPr>
-        <w:rFonts w:ascii="Symbol" w:hAnsi="Symbol" w:cs="Symbol" w:hint="default"/>
-      </w:rPr>
-    </w:lvl>
-    <w:lvl w:ilvl="2">
-      <w:start w:val="1"/>
-      <w:numFmt w:val="bullet"/>
-      <w:lvlText w:val=""/>
-      <w:lvlJc w:val="left"/>
-      <w:pPr>
-        <w:tabs>
-          <w:tab w:val="num" w:pos="2127"/>
-        </w:tabs>
-        <w:ind w:left="2127" w:hanging="283"/>
-      </w:pPr>
-      <w:rPr>
-        <w:rFonts w:ascii="Symbol" w:hAnsi="Symbol" w:cs="Symbol" w:hint="default"/>
-      </w:rPr>
-    </w:lvl>
-    <w:lvl w:ilvl="3">
-      <w:start w:val="1"/>
-      <w:numFmt w:val="bullet"/>
-      <w:lvlText w:val=""/>
-      <w:lvlJc w:val="left"/>
-      <w:pPr>
-        <w:tabs>
-          <w:tab w:val="num" w:pos="2836"/>
-        </w:tabs>
-        <w:ind w:left="2836" w:hanging="283"/>
-      </w:pPr>
-      <w:rPr>
-        <w:rFonts w:ascii="Symbol" w:hAnsi="Symbol" w:cs="Symbol" w:hint="default"/>
-      </w:rPr>
-    </w:lvl>
-    <w:lvl w:ilvl="4">
-      <w:start w:val="1"/>
-      <w:numFmt w:val="bullet"/>
-      <w:lvlText w:val=""/>
-      <w:lvlJc w:val="left"/>
-      <w:pPr>
-        <w:tabs>
-          <w:tab w:val="num" w:pos="3545"/>
-        </w:tabs>
-        <w:ind w:left="3545" w:hanging="283"/>
-      </w:pPr>
-      <w:rPr>
-        <w:rFonts w:ascii="Symbol" w:hAnsi="Symbol" w:cs="Symbol" w:hint="default"/>
-      </w:rPr>
-    </w:lvl>
-    <w:lvl w:ilvl="5">
-      <w:start w:val="1"/>
-      <w:numFmt w:val="bullet"/>
-      <w:lvlText w:val=""/>
-      <w:lvlJc w:val="left"/>
-      <w:pPr>
-        <w:tabs>
-          <w:tab w:val="num" w:pos="4254"/>
-        </w:tabs>
-        <w:ind w:left="4254" w:hanging="283"/>
-      </w:pPr>
-      <w:rPr>
-        <w:rFonts w:ascii="Symbol" w:hAnsi="Symbol" w:cs="Symbol" w:hint="default"/>
-      </w:rPr>
-    </w:lvl>
-    <w:lvl w:ilvl="6">
-      <w:start w:val="1"/>
-      <w:numFmt w:val="bullet"/>
-      <w:lvlText w:val=""/>
-      <w:lvlJc w:val="left"/>
-      <w:pPr>
-        <w:tabs>
-          <w:tab w:val="num" w:pos="4963"/>
-        </w:tabs>
-        <w:ind w:left="4963" w:hanging="283"/>
-      </w:pPr>
-      <w:rPr>
-        <w:rFonts w:ascii="Symbol" w:hAnsi="Symbol" w:cs="Symbol" w:hint="default"/>
-      </w:rPr>
-    </w:lvl>
-    <w:lvl w:ilvl="7">
-      <w:start w:val="1"/>
-      <w:numFmt w:val="bullet"/>
-      <w:lvlText w:val=""/>
-      <w:lvlJc w:val="left"/>
-      <w:pPr>
-        <w:tabs>
-          <w:tab w:val="num" w:pos="5672"/>
-        </w:tabs>
-        <w:ind w:left="5672" w:hanging="283"/>
-      </w:pPr>
-      <w:rPr>
-        <w:rFonts w:ascii="Symbol" w:hAnsi="Symbol" w:cs="Symbol" w:hint="default"/>
-      </w:rPr>
-    </w:lvl>
-    <w:lvl w:ilvl="8">
-      <w:start w:val="1"/>
-      <w:numFmt w:val="bullet"/>
-      <w:lvlText w:val=""/>
-      <w:lvlJc w:val="left"/>
-      <w:pPr>
-        <w:tabs>
-          <w:tab w:val="num" w:pos="6381"/>
-        </w:tabs>
-        <w:ind w:left="6381" w:hanging="283"/>
-      </w:pPr>
-      <w:rPr>
-        <w:rFonts w:ascii="Symbol" w:hAnsi="Symbol" w:cs="Symbol" w:hint="default"/>
-      </w:rPr>
-    </w:lvl>
-  </w:abstractNum>
-  <w:abstractNum w:abstractNumId="50">
-    <w:lvl w:ilvl="0">
-      <w:start w:val="1"/>
-      <w:numFmt w:val="bullet"/>
-      <w:lvlText w:val=""/>
-      <w:lvlJc w:val="left"/>
-      <w:pPr>
-        <w:tabs>
-          <w:tab w:val="num" w:pos="709"/>
-        </w:tabs>
-        <w:ind w:left="709" w:hanging="283"/>
-      </w:pPr>
-      <w:rPr>
-        <w:rFonts w:ascii="Symbol" w:hAnsi="Symbol" w:cs="Symbol" w:hint="default"/>
-      </w:rPr>
-    </w:lvl>
-    <w:lvl w:ilvl="1">
-      <w:start w:val="1"/>
-      <w:numFmt w:val="bullet"/>
-      <w:lvlText w:val=""/>
-      <w:lvlJc w:val="left"/>
-      <w:pPr>
-        <w:tabs>
-          <w:tab w:val="num" w:pos="1418"/>
-        </w:tabs>
-        <w:ind w:left="1418" w:hanging="283"/>
-      </w:pPr>
-      <w:rPr>
-        <w:rFonts w:ascii="Symbol" w:hAnsi="Symbol" w:cs="Symbol" w:hint="default"/>
-      </w:rPr>
-    </w:lvl>
-    <w:lvl w:ilvl="2">
-      <w:start w:val="1"/>
-      <w:numFmt w:val="bullet"/>
-      <w:lvlText w:val=""/>
-      <w:lvlJc w:val="left"/>
-      <w:pPr>
-        <w:tabs>
-          <w:tab w:val="num" w:pos="2127"/>
-        </w:tabs>
-        <w:ind w:left="2127" w:hanging="283"/>
-      </w:pPr>
-      <w:rPr>
-        <w:rFonts w:ascii="Symbol" w:hAnsi="Symbol" w:cs="Symbol" w:hint="default"/>
-      </w:rPr>
-    </w:lvl>
-    <w:lvl w:ilvl="3">
-      <w:start w:val="1"/>
-      <w:numFmt w:val="bullet"/>
-      <w:lvlText w:val=""/>
-      <w:lvlJc w:val="left"/>
-      <w:pPr>
-        <w:tabs>
-          <w:tab w:val="num" w:pos="2836"/>
-        </w:tabs>
-        <w:ind w:left="2836" w:hanging="283"/>
-      </w:pPr>
-      <w:rPr>
-        <w:rFonts w:ascii="Symbol" w:hAnsi="Symbol" w:cs="Symbol" w:hint="default"/>
-      </w:rPr>
-    </w:lvl>
-    <w:lvl w:ilvl="4">
-      <w:start w:val="1"/>
-      <w:numFmt w:val="bullet"/>
-      <w:lvlText w:val=""/>
-      <w:lvlJc w:val="left"/>
-      <w:pPr>
-        <w:tabs>
-          <w:tab w:val="num" w:pos="3545"/>
-        </w:tabs>
-        <w:ind w:left="3545" w:hanging="283"/>
-      </w:pPr>
-      <w:rPr>
-        <w:rFonts w:ascii="Symbol" w:hAnsi="Symbol" w:cs="Symbol" w:hint="default"/>
-      </w:rPr>
-    </w:lvl>
-    <w:lvl w:ilvl="5">
-      <w:start w:val="1"/>
-      <w:numFmt w:val="bullet"/>
-      <w:lvlText w:val=""/>
-      <w:lvlJc w:val="left"/>
-      <w:pPr>
-        <w:tabs>
-          <w:tab w:val="num" w:pos="4254"/>
-        </w:tabs>
-        <w:ind w:left="4254" w:hanging="283"/>
-      </w:pPr>
-      <w:rPr>
-        <w:rFonts w:ascii="Symbol" w:hAnsi="Symbol" w:cs="Symbol" w:hint="default"/>
-      </w:rPr>
-    </w:lvl>
-    <w:lvl w:ilvl="6">
-      <w:start w:val="1"/>
-      <w:numFmt w:val="bullet"/>
-      <w:lvlText w:val=""/>
-      <w:lvlJc w:val="left"/>
-      <w:pPr>
-        <w:tabs>
-          <w:tab w:val="num" w:pos="4963"/>
-        </w:tabs>
-        <w:ind w:left="4963" w:hanging="283"/>
-      </w:pPr>
-      <w:rPr>
-        <w:rFonts w:ascii="Symbol" w:hAnsi="Symbol" w:cs="Symbol" w:hint="default"/>
-      </w:rPr>
-    </w:lvl>
-    <w:lvl w:ilvl="7">
-      <w:start w:val="1"/>
-      <w:numFmt w:val="bullet"/>
-      <w:lvlText w:val=""/>
-      <w:lvlJc w:val="left"/>
-      <w:pPr>
-        <w:tabs>
-          <w:tab w:val="num" w:pos="5672"/>
-        </w:tabs>
-        <w:ind w:left="5672" w:hanging="283"/>
-      </w:pPr>
-      <w:rPr>
-        <w:rFonts w:ascii="Symbol" w:hAnsi="Symbol" w:cs="Symbol" w:hint="default"/>
-      </w:rPr>
-    </w:lvl>
-    <w:lvl w:ilvl="8">
-      <w:start w:val="1"/>
-      <w:numFmt w:val="bullet"/>
-      <w:lvlText w:val=""/>
-      <w:lvlJc w:val="left"/>
-      <w:pPr>
-        <w:tabs>
-          <w:tab w:val="num" w:pos="6381"/>
-        </w:tabs>
-        <w:ind w:left="6381" w:hanging="283"/>
-      </w:pPr>
-      <w:rPr>
-        <w:rFonts w:ascii="Symbol" w:hAnsi="Symbol" w:cs="Symbol" w:hint="default"/>
-      </w:rPr>
-    </w:lvl>
-  </w:abstractNum>
-  <w:abstractNum w:abstractNumId="51">
-    <w:lvl w:ilvl="0">
-      <w:start w:val="1"/>
-      <w:numFmt w:val="bullet"/>
-      <w:lvlText w:val=""/>
-      <w:lvlJc w:val="left"/>
-      <w:pPr>
-        <w:tabs>
-          <w:tab w:val="num" w:pos="709"/>
-        </w:tabs>
-        <w:ind w:left="709" w:hanging="283"/>
-      </w:pPr>
-      <w:rPr>
-        <w:rFonts w:ascii="Symbol" w:hAnsi="Symbol" w:cs="Symbol" w:hint="default"/>
-      </w:rPr>
-    </w:lvl>
-    <w:lvl w:ilvl="1">
-      <w:start w:val="1"/>
-      <w:numFmt w:val="bullet"/>
-      <w:lvlText w:val=""/>
-      <w:lvlJc w:val="left"/>
-      <w:pPr>
-        <w:tabs>
-          <w:tab w:val="num" w:pos="1418"/>
-        </w:tabs>
-        <w:ind w:left="1418" w:hanging="283"/>
-      </w:pPr>
-      <w:rPr>
-        <w:rFonts w:ascii="Symbol" w:hAnsi="Symbol" w:cs="Symbol" w:hint="default"/>
-      </w:rPr>
-    </w:lvl>
-    <w:lvl w:ilvl="2">
-      <w:start w:val="1"/>
-      <w:numFmt w:val="bullet"/>
-      <w:lvlText w:val=""/>
-      <w:lvlJc w:val="left"/>
-      <w:pPr>
-        <w:tabs>
-          <w:tab w:val="num" w:pos="2127"/>
-        </w:tabs>
-        <w:ind w:left="2127" w:hanging="283"/>
-      </w:pPr>
-      <w:rPr>
-        <w:rFonts w:ascii="Symbol" w:hAnsi="Symbol" w:cs="Symbol" w:hint="default"/>
-      </w:rPr>
-    </w:lvl>
-    <w:lvl w:ilvl="3">
-      <w:start w:val="1"/>
-      <w:numFmt w:val="bullet"/>
-      <w:lvlText w:val=""/>
-      <w:lvlJc w:val="left"/>
-      <w:pPr>
-        <w:tabs>
-          <w:tab w:val="num" w:pos="2836"/>
-        </w:tabs>
-        <w:ind w:left="2836" w:hanging="283"/>
-      </w:pPr>
-      <w:rPr>
-        <w:rFonts w:ascii="Symbol" w:hAnsi="Symbol" w:cs="Symbol" w:hint="default"/>
-      </w:rPr>
-    </w:lvl>
-    <w:lvl w:ilvl="4">
-      <w:start w:val="1"/>
-      <w:numFmt w:val="bullet"/>
-      <w:lvlText w:val=""/>
-      <w:lvlJc w:val="left"/>
-      <w:pPr>
-        <w:tabs>
-          <w:tab w:val="num" w:pos="3545"/>
-        </w:tabs>
-        <w:ind w:left="3545" w:hanging="283"/>
-      </w:pPr>
-      <w:rPr>
-        <w:rFonts w:ascii="Symbol" w:hAnsi="Symbol" w:cs="Symbol" w:hint="default"/>
-      </w:rPr>
-    </w:lvl>
-    <w:lvl w:ilvl="5">
-      <w:start w:val="1"/>
-      <w:numFmt w:val="bullet"/>
-      <w:lvlText w:val=""/>
-      <w:lvlJc w:val="left"/>
-      <w:pPr>
-        <w:tabs>
-          <w:tab w:val="num" w:pos="4254"/>
-        </w:tabs>
-        <w:ind w:left="4254" w:hanging="283"/>
-      </w:pPr>
-      <w:rPr>
-        <w:rFonts w:ascii="Symbol" w:hAnsi="Symbol" w:cs="Symbol" w:hint="default"/>
-      </w:rPr>
-    </w:lvl>
-    <w:lvl w:ilvl="6">
-      <w:start w:val="1"/>
-      <w:numFmt w:val="bullet"/>
-      <w:lvlText w:val=""/>
-      <w:lvlJc w:val="left"/>
-      <w:pPr>
-        <w:tabs>
-          <w:tab w:val="num" w:pos="4963"/>
-        </w:tabs>
-        <w:ind w:left="4963" w:hanging="283"/>
-      </w:pPr>
-      <w:rPr>
-        <w:rFonts w:ascii="Symbol" w:hAnsi="Symbol" w:cs="Symbol" w:hint="default"/>
-      </w:rPr>
-    </w:lvl>
-    <w:lvl w:ilvl="7">
-      <w:start w:val="1"/>
-      <w:numFmt w:val="bullet"/>
-      <w:lvlText w:val=""/>
-      <w:lvlJc w:val="left"/>
-      <w:pPr>
-        <w:tabs>
-          <w:tab w:val="num" w:pos="5672"/>
-        </w:tabs>
-        <w:ind w:left="5672" w:hanging="283"/>
-      </w:pPr>
-      <w:rPr>
-        <w:rFonts w:ascii="Symbol" w:hAnsi="Symbol" w:cs="Symbol" w:hint="default"/>
-      </w:rPr>
-    </w:lvl>
-    <w:lvl w:ilvl="8">
-      <w:start w:val="1"/>
-      <w:numFmt w:val="bullet"/>
-      <w:lvlText w:val=""/>
-      <w:lvlJc w:val="left"/>
-      <w:pPr>
-        <w:tabs>
-          <w:tab w:val="num" w:pos="6381"/>
-        </w:tabs>
-        <w:ind w:left="6381" w:hanging="283"/>
-      </w:pPr>
-      <w:rPr>
-        <w:rFonts w:ascii="Symbol" w:hAnsi="Symbol" w:cs="Symbol" w:hint="default"/>
-      </w:rPr>
-    </w:lvl>
-  </w:abstractNum>
-  <w:abstractNum w:abstractNumId="52">
-    <w:lvl w:ilvl="0">
-      <w:start w:val="1"/>
-      <w:numFmt w:val="bullet"/>
-      <w:lvlText w:val=""/>
-      <w:lvlJc w:val="left"/>
-      <w:pPr>
-        <w:tabs>
-          <w:tab w:val="num" w:pos="709"/>
-        </w:tabs>
-        <w:ind w:left="709" w:hanging="283"/>
-      </w:pPr>
-      <w:rPr>
-        <w:rFonts w:ascii="Symbol" w:hAnsi="Symbol" w:cs="Symbol" w:hint="default"/>
-      </w:rPr>
-    </w:lvl>
-    <w:lvl w:ilvl="1">
-      <w:start w:val="1"/>
-      <w:numFmt w:val="bullet"/>
-      <w:lvlText w:val=""/>
-      <w:lvlJc w:val="left"/>
-      <w:pPr>
-        <w:tabs>
-          <w:tab w:val="num" w:pos="1418"/>
-        </w:tabs>
-        <w:ind w:left="1418" w:hanging="283"/>
-      </w:pPr>
-      <w:rPr>
-        <w:rFonts w:ascii="Symbol" w:hAnsi="Symbol" w:cs="Symbol" w:hint="default"/>
-      </w:rPr>
-    </w:lvl>
-    <w:lvl w:ilvl="2">
-      <w:start w:val="1"/>
-      <w:numFmt w:val="bullet"/>
-      <w:lvlText w:val=""/>
-      <w:lvlJc w:val="left"/>
-      <w:pPr>
-        <w:tabs>
-          <w:tab w:val="num" w:pos="2127"/>
-        </w:tabs>
-        <w:ind w:left="2127" w:hanging="283"/>
-      </w:pPr>
-      <w:rPr>
-        <w:rFonts w:ascii="Symbol" w:hAnsi="Symbol" w:cs="Symbol" w:hint="default"/>
-      </w:rPr>
-    </w:lvl>
-    <w:lvl w:ilvl="3">
-      <w:start w:val="1"/>
-      <w:numFmt w:val="bullet"/>
-      <w:lvlText w:val=""/>
-      <w:lvlJc w:val="left"/>
-      <w:pPr>
-        <w:tabs>
-          <w:tab w:val="num" w:pos="2836"/>
-        </w:tabs>
-        <w:ind w:left="2836" w:hanging="283"/>
-      </w:pPr>
-      <w:rPr>
-        <w:rFonts w:ascii="Symbol" w:hAnsi="Symbol" w:cs="Symbol" w:hint="default"/>
-      </w:rPr>
-    </w:lvl>
-    <w:lvl w:ilvl="4">
-      <w:start w:val="1"/>
-      <w:numFmt w:val="bullet"/>
-      <w:lvlText w:val=""/>
-      <w:lvlJc w:val="left"/>
-      <w:pPr>
-        <w:tabs>
-          <w:tab w:val="num" w:pos="3545"/>
-        </w:tabs>
-        <w:ind w:left="3545" w:hanging="283"/>
-      </w:pPr>
-      <w:rPr>
-        <w:rFonts w:ascii="Symbol" w:hAnsi="Symbol" w:cs="Symbol" w:hint="default"/>
-      </w:rPr>
-    </w:lvl>
-    <w:lvl w:ilvl="5">
-      <w:start w:val="1"/>
-      <w:numFmt w:val="bullet"/>
-      <w:lvlText w:val=""/>
-      <w:lvlJc w:val="left"/>
-      <w:pPr>
-        <w:tabs>
-          <w:tab w:val="num" w:pos="4254"/>
-        </w:tabs>
-        <w:ind w:left="4254" w:hanging="283"/>
-      </w:pPr>
-      <w:rPr>
-        <w:rFonts w:ascii="Symbol" w:hAnsi="Symbol" w:cs="Symbol" w:hint="default"/>
-      </w:rPr>
-    </w:lvl>
-    <w:lvl w:ilvl="6">
-      <w:start w:val="1"/>
-      <w:numFmt w:val="bullet"/>
-      <w:lvlText w:val=""/>
-      <w:lvlJc w:val="left"/>
-      <w:pPr>
-        <w:tabs>
-          <w:tab w:val="num" w:pos="4963"/>
-        </w:tabs>
-        <w:ind w:left="4963" w:hanging="283"/>
-      </w:pPr>
-      <w:rPr>
-        <w:rFonts w:ascii="Symbol" w:hAnsi="Symbol" w:cs="Symbol" w:hint="default"/>
-      </w:rPr>
-    </w:lvl>
-    <w:lvl w:ilvl="7">
-      <w:start w:val="1"/>
-      <w:numFmt w:val="bullet"/>
-      <w:lvlText w:val=""/>
-      <w:lvlJc w:val="left"/>
-      <w:pPr>
-        <w:tabs>
-          <w:tab w:val="num" w:pos="5672"/>
-        </w:tabs>
-        <w:ind w:left="5672" w:hanging="283"/>
-      </w:pPr>
-      <w:rPr>
-        <w:rFonts w:ascii="Symbol" w:hAnsi="Symbol" w:cs="Symbol" w:hint="default"/>
-      </w:rPr>
-    </w:lvl>
-    <w:lvl w:ilvl="8">
-      <w:start w:val="1"/>
-      <w:numFmt w:val="bullet"/>
-      <w:lvlText w:val=""/>
-      <w:lvlJc w:val="left"/>
-      <w:pPr>
-        <w:tabs>
-          <w:tab w:val="num" w:pos="6381"/>
-        </w:tabs>
-        <w:ind w:left="6381" w:hanging="283"/>
-      </w:pPr>
-      <w:rPr>
-        <w:rFonts w:ascii="Symbol" w:hAnsi="Symbol" w:cs="Symbol" w:hint="default"/>
-      </w:rPr>
-    </w:lvl>
-  </w:abstractNum>
-  <w:abstractNum w:abstractNumId="53">
-    <w:lvl w:ilvl="0">
-      <w:start w:val="1"/>
-      <w:numFmt w:val="bullet"/>
-      <w:lvlText w:val=""/>
-      <w:lvlJc w:val="left"/>
-      <w:pPr>
-        <w:tabs>
-          <w:tab w:val="num" w:pos="709"/>
-        </w:tabs>
-        <w:ind w:left="709" w:hanging="283"/>
-      </w:pPr>
-      <w:rPr>
-        <w:rFonts w:ascii="Symbol" w:hAnsi="Symbol" w:cs="Symbol" w:hint="default"/>
-      </w:rPr>
-    </w:lvl>
-    <w:lvl w:ilvl="1">
-      <w:start w:val="1"/>
-      <w:numFmt w:val="bullet"/>
-      <w:lvlText w:val=""/>
-      <w:lvlJc w:val="left"/>
-      <w:pPr>
-        <w:tabs>
-          <w:tab w:val="num" w:pos="1418"/>
-        </w:tabs>
-        <w:ind w:left="1418" w:hanging="283"/>
-      </w:pPr>
-      <w:rPr>
-        <w:rFonts w:ascii="Symbol" w:hAnsi="Symbol" w:cs="Symbol" w:hint="default"/>
-      </w:rPr>
-    </w:lvl>
-    <w:lvl w:ilvl="2">
-      <w:start w:val="1"/>
-      <w:numFmt w:val="bullet"/>
-      <w:lvlText w:val=""/>
-      <w:lvlJc w:val="left"/>
-      <w:pPr>
-        <w:tabs>
-          <w:tab w:val="num" w:pos="2127"/>
-        </w:tabs>
-        <w:ind w:left="2127" w:hanging="283"/>
-      </w:pPr>
-      <w:rPr>
-        <w:rFonts w:ascii="Symbol" w:hAnsi="Symbol" w:cs="Symbol" w:hint="default"/>
-      </w:rPr>
-    </w:lvl>
-    <w:lvl w:ilvl="3">
-      <w:start w:val="1"/>
-      <w:numFmt w:val="bullet"/>
-      <w:lvlText w:val=""/>
-      <w:lvlJc w:val="left"/>
-      <w:pPr>
-        <w:tabs>
-          <w:tab w:val="num" w:pos="2836"/>
-        </w:tabs>
-        <w:ind w:left="2836" w:hanging="283"/>
-      </w:pPr>
-      <w:rPr>
-        <w:rFonts w:ascii="Symbol" w:hAnsi="Symbol" w:cs="Symbol" w:hint="default"/>
-      </w:rPr>
-    </w:lvl>
-    <w:lvl w:ilvl="4">
-      <w:start w:val="1"/>
-      <w:numFmt w:val="bullet"/>
-      <w:lvlText w:val=""/>
-      <w:lvlJc w:val="left"/>
-      <w:pPr>
-        <w:tabs>
-          <w:tab w:val="num" w:pos="3545"/>
-        </w:tabs>
-        <w:ind w:left="3545" w:hanging="283"/>
-      </w:pPr>
-      <w:rPr>
-        <w:rFonts w:ascii="Symbol" w:hAnsi="Symbol" w:cs="Symbol" w:hint="default"/>
-      </w:rPr>
-    </w:lvl>
-    <w:lvl w:ilvl="5">
-      <w:start w:val="1"/>
-      <w:numFmt w:val="bullet"/>
-      <w:lvlText w:val=""/>
-      <w:lvlJc w:val="left"/>
-      <w:pPr>
-        <w:tabs>
-          <w:tab w:val="num" w:pos="4254"/>
-        </w:tabs>
-        <w:ind w:left="4254" w:hanging="283"/>
-      </w:pPr>
-      <w:rPr>
-        <w:rFonts w:ascii="Symbol" w:hAnsi="Symbol" w:cs="Symbol" w:hint="default"/>
-      </w:rPr>
-    </w:lvl>
-    <w:lvl w:ilvl="6">
-      <w:start w:val="1"/>
-      <w:numFmt w:val="bullet"/>
-      <w:lvlText w:val=""/>
-      <w:lvlJc w:val="left"/>
-      <w:pPr>
-        <w:tabs>
-          <w:tab w:val="num" w:pos="4963"/>
-        </w:tabs>
-        <w:ind w:left="4963" w:hanging="283"/>
-      </w:pPr>
-      <w:rPr>
-        <w:rFonts w:ascii="Symbol" w:hAnsi="Symbol" w:cs="Symbol" w:hint="default"/>
-      </w:rPr>
-    </w:lvl>
-    <w:lvl w:ilvl="7">
-      <w:start w:val="1"/>
-      <w:numFmt w:val="bullet"/>
-      <w:lvlText w:val=""/>
-      <w:lvlJc w:val="left"/>
-      <w:pPr>
-        <w:tabs>
-          <w:tab w:val="num" w:pos="5672"/>
-        </w:tabs>
-        <w:ind w:left="5672" w:hanging="283"/>
-      </w:pPr>
-      <w:rPr>
-        <w:rFonts w:ascii="Symbol" w:hAnsi="Symbol" w:cs="Symbol" w:hint="default"/>
-      </w:rPr>
-    </w:lvl>
-    <w:lvl w:ilvl="8">
-      <w:start w:val="1"/>
-      <w:numFmt w:val="bullet"/>
-      <w:lvlText w:val=""/>
-      <w:lvlJc w:val="left"/>
-      <w:pPr>
-        <w:tabs>
-          <w:tab w:val="num" w:pos="6381"/>
-        </w:tabs>
-        <w:ind w:left="6381" w:hanging="283"/>
-      </w:pPr>
-      <w:rPr>
-        <w:rFonts w:ascii="Symbol" w:hAnsi="Symbol" w:cs="Symbol" w:hint="default"/>
-      </w:rPr>
-    </w:lvl>
-  </w:abstractNum>
-  <w:abstractNum w:abstractNumId="54">
-    <w:lvl w:ilvl="0">
-      <w:start w:val="1"/>
-      <w:numFmt w:val="bullet"/>
-      <w:lvlText w:val=""/>
-      <w:lvlJc w:val="left"/>
-      <w:pPr>
-        <w:tabs>
-          <w:tab w:val="num" w:pos="709"/>
-        </w:tabs>
-        <w:ind w:left="709" w:hanging="283"/>
-      </w:pPr>
-      <w:rPr>
-        <w:rFonts w:ascii="Symbol" w:hAnsi="Symbol" w:cs="Symbol" w:hint="default"/>
-      </w:rPr>
-    </w:lvl>
-    <w:lvl w:ilvl="1">
-      <w:start w:val="1"/>
-      <w:numFmt w:val="bullet"/>
-      <w:lvlText w:val=""/>
-      <w:lvlJc w:val="left"/>
-      <w:pPr>
-        <w:tabs>
-          <w:tab w:val="num" w:pos="1418"/>
-        </w:tabs>
-        <w:ind w:left="1418" w:hanging="283"/>
-      </w:pPr>
-      <w:rPr>
-        <w:rFonts w:ascii="Symbol" w:hAnsi="Symbol" w:cs="Symbol" w:hint="default"/>
-      </w:rPr>
-    </w:lvl>
-    <w:lvl w:ilvl="2">
-      <w:start w:val="1"/>
-      <w:numFmt w:val="bullet"/>
-      <w:lvlText w:val=""/>
-      <w:lvlJc w:val="left"/>
-      <w:pPr>
-        <w:tabs>
-          <w:tab w:val="num" w:pos="2127"/>
-        </w:tabs>
-        <w:ind w:left="2127" w:hanging="283"/>
-      </w:pPr>
-      <w:rPr>
-        <w:rFonts w:ascii="Symbol" w:hAnsi="Symbol" w:cs="Symbol" w:hint="default"/>
-      </w:rPr>
-    </w:lvl>
-    <w:lvl w:ilvl="3">
-      <w:start w:val="1"/>
-      <w:numFmt w:val="bullet"/>
-      <w:lvlText w:val=""/>
-      <w:lvlJc w:val="left"/>
-      <w:pPr>
-        <w:tabs>
-          <w:tab w:val="num" w:pos="2836"/>
-        </w:tabs>
-        <w:ind w:left="2836" w:hanging="283"/>
-      </w:pPr>
-      <w:rPr>
-        <w:rFonts w:ascii="Symbol" w:hAnsi="Symbol" w:cs="Symbol" w:hint="default"/>
-      </w:rPr>
-    </w:lvl>
-    <w:lvl w:ilvl="4">
-      <w:start w:val="1"/>
-      <w:numFmt w:val="bullet"/>
-      <w:lvlText w:val=""/>
-      <w:lvlJc w:val="left"/>
-      <w:pPr>
-        <w:tabs>
-          <w:tab w:val="num" w:pos="3545"/>
-        </w:tabs>
-        <w:ind w:left="3545" w:hanging="283"/>
-      </w:pPr>
-      <w:rPr>
-        <w:rFonts w:ascii="Symbol" w:hAnsi="Symbol" w:cs="Symbol" w:hint="default"/>
-      </w:rPr>
-    </w:lvl>
-    <w:lvl w:ilvl="5">
-      <w:start w:val="1"/>
-      <w:numFmt w:val="bullet"/>
-      <w:lvlText w:val=""/>
-      <w:lvlJc w:val="left"/>
-      <w:pPr>
-        <w:tabs>
-          <w:tab w:val="num" w:pos="4254"/>
-        </w:tabs>
-        <w:ind w:left="4254" w:hanging="283"/>
-      </w:pPr>
-      <w:rPr>
-        <w:rFonts w:ascii="Symbol" w:hAnsi="Symbol" w:cs="Symbol" w:hint="default"/>
-      </w:rPr>
-    </w:lvl>
-    <w:lvl w:ilvl="6">
-      <w:start w:val="1"/>
-      <w:numFmt w:val="bullet"/>
-      <w:lvlText w:val=""/>
-      <w:lvlJc w:val="left"/>
-      <w:pPr>
-        <w:tabs>
-          <w:tab w:val="num" w:pos="4963"/>
-        </w:tabs>
-        <w:ind w:left="4963" w:hanging="283"/>
-      </w:pPr>
-      <w:rPr>
-        <w:rFonts w:ascii="Symbol" w:hAnsi="Symbol" w:cs="Symbol" w:hint="default"/>
-      </w:rPr>
-    </w:lvl>
-    <w:lvl w:ilvl="7">
-      <w:start w:val="1"/>
-      <w:numFmt w:val="bullet"/>
-      <w:lvlText w:val=""/>
-      <w:lvlJc w:val="left"/>
-      <w:pPr>
-        <w:tabs>
-          <w:tab w:val="num" w:pos="5672"/>
-        </w:tabs>
-        <w:ind w:left="5672" w:hanging="283"/>
-      </w:pPr>
-      <w:rPr>
-        <w:rFonts w:ascii="Symbol" w:hAnsi="Symbol" w:cs="Symbol" w:hint="default"/>
-      </w:rPr>
-    </w:lvl>
-    <w:lvl w:ilvl="8">
-      <w:start w:val="1"/>
-      <w:numFmt w:val="bullet"/>
-      <w:lvlText w:val=""/>
-      <w:lvlJc w:val="left"/>
-      <w:pPr>
-        <w:tabs>
-          <w:tab w:val="num" w:pos="6381"/>
-        </w:tabs>
-        <w:ind w:left="6381" w:hanging="283"/>
-      </w:pPr>
-      <w:rPr>
-        <w:rFonts w:ascii="Symbol" w:hAnsi="Symbol" w:cs="Symbol" w:hint="default"/>
-      </w:rPr>
-    </w:lvl>
-  </w:abstractNum>
-  <w:abstractNum w:abstractNumId="55">
-    <w:lvl w:ilvl="0">
-      <w:start w:val="1"/>
-      <w:numFmt w:val="bullet"/>
-      <w:lvlText w:val=""/>
-      <w:lvlJc w:val="left"/>
-      <w:pPr>
-        <w:tabs>
-          <w:tab w:val="num" w:pos="709"/>
-        </w:tabs>
-        <w:ind w:left="709" w:hanging="283"/>
-      </w:pPr>
-      <w:rPr>
-        <w:rFonts w:ascii="Symbol" w:hAnsi="Symbol" w:cs="Symbol" w:hint="default"/>
-      </w:rPr>
-    </w:lvl>
-    <w:lvl w:ilvl="1">
-      <w:start w:val="1"/>
-      <w:numFmt w:val="bullet"/>
-      <w:lvlText w:val=""/>
-      <w:lvlJc w:val="left"/>
-      <w:pPr>
-        <w:tabs>
-          <w:tab w:val="num" w:pos="1418"/>
-        </w:tabs>
-        <w:ind w:left="1418" w:hanging="283"/>
-      </w:pPr>
-      <w:rPr>
-        <w:rFonts w:ascii="Symbol" w:hAnsi="Symbol" w:cs="Symbol" w:hint="default"/>
-      </w:rPr>
-    </w:lvl>
-    <w:lvl w:ilvl="2">
-      <w:start w:val="1"/>
-      <w:numFmt w:val="bullet"/>
-      <w:lvlText w:val=""/>
-      <w:lvlJc w:val="left"/>
-      <w:pPr>
-        <w:tabs>
-          <w:tab w:val="num" w:pos="2127"/>
-        </w:tabs>
-        <w:ind w:left="2127" w:hanging="283"/>
-      </w:pPr>
-      <w:rPr>
-        <w:rFonts w:ascii="Symbol" w:hAnsi="Symbol" w:cs="Symbol" w:hint="default"/>
-      </w:rPr>
-    </w:lvl>
-    <w:lvl w:ilvl="3">
-      <w:start w:val="1"/>
-      <w:numFmt w:val="bullet"/>
-      <w:lvlText w:val=""/>
-      <w:lvlJc w:val="left"/>
-      <w:pPr>
-        <w:tabs>
-          <w:tab w:val="num" w:pos="2836"/>
-        </w:tabs>
-        <w:ind w:left="2836" w:hanging="283"/>
-      </w:pPr>
-      <w:rPr>
-        <w:rFonts w:ascii="Symbol" w:hAnsi="Symbol" w:cs="Symbol" w:hint="default"/>
-      </w:rPr>
-    </w:lvl>
-    <w:lvl w:ilvl="4">
-      <w:start w:val="1"/>
-      <w:numFmt w:val="bullet"/>
-      <w:lvlText w:val=""/>
-      <w:lvlJc w:val="left"/>
-      <w:pPr>
-        <w:tabs>
-          <w:tab w:val="num" w:pos="3545"/>
-        </w:tabs>
-        <w:ind w:left="3545" w:hanging="283"/>
-      </w:pPr>
-      <w:rPr>
-        <w:rFonts w:ascii="Symbol" w:hAnsi="Symbol" w:cs="Symbol" w:hint="default"/>
-      </w:rPr>
-    </w:lvl>
-    <w:lvl w:ilvl="5">
-      <w:start w:val="1"/>
-      <w:numFmt w:val="bullet"/>
-      <w:lvlText w:val=""/>
-      <w:lvlJc w:val="left"/>
-      <w:pPr>
-        <w:tabs>
-          <w:tab w:val="num" w:pos="4254"/>
-        </w:tabs>
-        <w:ind w:left="4254" w:hanging="283"/>
-      </w:pPr>
-      <w:rPr>
-        <w:rFonts w:ascii="Symbol" w:hAnsi="Symbol" w:cs="Symbol" w:hint="default"/>
-      </w:rPr>
-    </w:lvl>
-    <w:lvl w:ilvl="6">
-      <w:start w:val="1"/>
-      <w:numFmt w:val="bullet"/>
-      <w:lvlText w:val=""/>
-      <w:lvlJc w:val="left"/>
-      <w:pPr>
-        <w:tabs>
-          <w:tab w:val="num" w:pos="4963"/>
-        </w:tabs>
-        <w:ind w:left="4963" w:hanging="283"/>
-      </w:pPr>
-      <w:rPr>
-        <w:rFonts w:ascii="Symbol" w:hAnsi="Symbol" w:cs="Symbol" w:hint="default"/>
-      </w:rPr>
-    </w:lvl>
-    <w:lvl w:ilvl="7">
-      <w:start w:val="1"/>
-      <w:numFmt w:val="bullet"/>
-      <w:lvlText w:val=""/>
-      <w:lvlJc w:val="left"/>
-      <w:pPr>
-        <w:tabs>
-          <w:tab w:val="num" w:pos="5672"/>
-        </w:tabs>
-        <w:ind w:left="5672" w:hanging="283"/>
-      </w:pPr>
-      <w:rPr>
-        <w:rFonts w:ascii="Symbol" w:hAnsi="Symbol" w:cs="Symbol" w:hint="default"/>
-      </w:rPr>
-    </w:lvl>
-    <w:lvl w:ilvl="8">
-      <w:start w:val="1"/>
-      <w:numFmt w:val="bullet"/>
-      <w:lvlText w:val=""/>
-      <w:lvlJc w:val="left"/>
-      <w:pPr>
-        <w:tabs>
-          <w:tab w:val="num" w:pos="6381"/>
-        </w:tabs>
-        <w:ind w:left="6381" w:hanging="283"/>
-      </w:pPr>
-      <w:rPr>
-        <w:rFonts w:ascii="Symbol" w:hAnsi="Symbol" w:cs="Symbol" w:hint="default"/>
-      </w:rPr>
-    </w:lvl>
-  </w:abstractNum>
-  <w:abstractNum w:abstractNumId="56">
-    <w:lvl w:ilvl="0">
-      <w:start w:val="1"/>
-      <w:numFmt w:val="bullet"/>
-      <w:lvlText w:val=""/>
-      <w:lvlJc w:val="left"/>
-      <w:pPr>
-        <w:tabs>
-          <w:tab w:val="num" w:pos="709"/>
-        </w:tabs>
-        <w:ind w:left="709" w:hanging="283"/>
-      </w:pPr>
-      <w:rPr>
-        <w:rFonts w:ascii="Symbol" w:hAnsi="Symbol" w:cs="Symbol" w:hint="default"/>
-      </w:rPr>
-    </w:lvl>
-    <w:lvl w:ilvl="1">
-      <w:start w:val="1"/>
-      <w:numFmt w:val="bullet"/>
-      <w:lvlText w:val=""/>
-      <w:lvlJc w:val="left"/>
-      <w:pPr>
-        <w:tabs>
-          <w:tab w:val="num" w:pos="1418"/>
-        </w:tabs>
-        <w:ind w:left="1418" w:hanging="283"/>
-      </w:pPr>
-      <w:rPr>
-        <w:rFonts w:ascii="Symbol" w:hAnsi="Symbol" w:cs="Symbol" w:hint="default"/>
-      </w:rPr>
-    </w:lvl>
-    <w:lvl w:ilvl="2">
-      <w:start w:val="1"/>
-      <w:numFmt w:val="bullet"/>
-      <w:lvlText w:val=""/>
-      <w:lvlJc w:val="left"/>
-      <w:pPr>
-        <w:tabs>
-          <w:tab w:val="num" w:pos="2127"/>
-        </w:tabs>
-        <w:ind w:left="2127" w:hanging="283"/>
-      </w:pPr>
-      <w:rPr>
-        <w:rFonts w:ascii="Symbol" w:hAnsi="Symbol" w:cs="Symbol" w:hint="default"/>
-      </w:rPr>
-    </w:lvl>
-    <w:lvl w:ilvl="3">
-      <w:start w:val="1"/>
-      <w:numFmt w:val="bullet"/>
-      <w:lvlText w:val=""/>
-      <w:lvlJc w:val="left"/>
-      <w:pPr>
-        <w:tabs>
-          <w:tab w:val="num" w:pos="2836"/>
-        </w:tabs>
-        <w:ind w:left="2836" w:hanging="283"/>
-      </w:pPr>
-      <w:rPr>
-        <w:rFonts w:ascii="Symbol" w:hAnsi="Symbol" w:cs="Symbol" w:hint="default"/>
-      </w:rPr>
-    </w:lvl>
-    <w:lvl w:ilvl="4">
-      <w:start w:val="1"/>
-      <w:numFmt w:val="bullet"/>
-      <w:lvlText w:val=""/>
-      <w:lvlJc w:val="left"/>
-      <w:pPr>
-        <w:tabs>
-          <w:tab w:val="num" w:pos="3545"/>
-        </w:tabs>
-        <w:ind w:left="3545" w:hanging="283"/>
-      </w:pPr>
-      <w:rPr>
-        <w:rFonts w:ascii="Symbol" w:hAnsi="Symbol" w:cs="Symbol" w:hint="default"/>
-      </w:rPr>
-    </w:lvl>
-    <w:lvl w:ilvl="5">
-      <w:start w:val="1"/>
-      <w:numFmt w:val="bullet"/>
-      <w:lvlText w:val=""/>
-      <w:lvlJc w:val="left"/>
-      <w:pPr>
-        <w:tabs>
-          <w:tab w:val="num" w:pos="4254"/>
-        </w:tabs>
-        <w:ind w:left="4254" w:hanging="283"/>
-      </w:pPr>
-      <w:rPr>
-        <w:rFonts w:ascii="Symbol" w:hAnsi="Symbol" w:cs="Symbol" w:hint="default"/>
-      </w:rPr>
-    </w:lvl>
-    <w:lvl w:ilvl="6">
-      <w:start w:val="1"/>
-      <w:numFmt w:val="bullet"/>
-      <w:lvlText w:val=""/>
-      <w:lvlJc w:val="left"/>
-      <w:pPr>
-        <w:tabs>
-          <w:tab w:val="num" w:pos="4963"/>
-        </w:tabs>
-        <w:ind w:left="4963" w:hanging="283"/>
-      </w:pPr>
-      <w:rPr>
-        <w:rFonts w:ascii="Symbol" w:hAnsi="Symbol" w:cs="Symbol" w:hint="default"/>
-      </w:rPr>
-    </w:lvl>
-    <w:lvl w:ilvl="7">
-      <w:start w:val="1"/>
-      <w:numFmt w:val="bullet"/>
-      <w:lvlText w:val=""/>
-      <w:lvlJc w:val="left"/>
-      <w:pPr>
-        <w:tabs>
-          <w:tab w:val="num" w:pos="5672"/>
-        </w:tabs>
-        <w:ind w:left="5672" w:hanging="283"/>
-      </w:pPr>
-      <w:rPr>
-        <w:rFonts w:ascii="Symbol" w:hAnsi="Symbol" w:cs="Symbol" w:hint="default"/>
-      </w:rPr>
-    </w:lvl>
-    <w:lvl w:ilvl="8">
-      <w:start w:val="1"/>
-      <w:numFmt w:val="bullet"/>
-      <w:lvlText w:val=""/>
-      <w:lvlJc w:val="left"/>
-      <w:pPr>
-        <w:tabs>
-          <w:tab w:val="num" w:pos="6381"/>
-        </w:tabs>
-        <w:ind w:left="6381" w:hanging="283"/>
-      </w:pPr>
-      <w:rPr>
-        <w:rFonts w:ascii="Symbol" w:hAnsi="Symbol" w:cs="Symbol" w:hint="default"/>
-      </w:rPr>
-    </w:lvl>
-  </w:abstractNum>
-  <w:abstractNum w:abstractNumId="57">
-    <w:lvl w:ilvl="0">
-      <w:start w:val="1"/>
-      <w:numFmt w:val="bullet"/>
-      <w:lvlText w:val=""/>
-      <w:lvlJc w:val="left"/>
-      <w:pPr>
-        <w:tabs>
-          <w:tab w:val="num" w:pos="709"/>
-        </w:tabs>
-        <w:ind w:left="709" w:hanging="283"/>
-      </w:pPr>
-      <w:rPr>
-        <w:rFonts w:ascii="Symbol" w:hAnsi="Symbol" w:cs="Symbol" w:hint="default"/>
-      </w:rPr>
-    </w:lvl>
-    <w:lvl w:ilvl="1">
-      <w:start w:val="1"/>
-      <w:numFmt w:val="bullet"/>
-      <w:lvlText w:val=""/>
-      <w:lvlJc w:val="left"/>
-      <w:pPr>
-        <w:tabs>
-          <w:tab w:val="num" w:pos="1418"/>
-        </w:tabs>
-        <w:ind w:left="1418" w:hanging="283"/>
-      </w:pPr>
-      <w:rPr>
-        <w:rFonts w:ascii="Symbol" w:hAnsi="Symbol" w:cs="Symbol" w:hint="default"/>
-      </w:rPr>
-    </w:lvl>
-    <w:lvl w:ilvl="2">
-      <w:start w:val="1"/>
-      <w:numFmt w:val="bullet"/>
-      <w:lvlText w:val=""/>
-      <w:lvlJc w:val="left"/>
-      <w:pPr>
-        <w:tabs>
-          <w:tab w:val="num" w:pos="2127"/>
-        </w:tabs>
-        <w:ind w:left="2127" w:hanging="283"/>
-      </w:pPr>
-      <w:rPr>
-        <w:rFonts w:ascii="Symbol" w:hAnsi="Symbol" w:cs="Symbol" w:hint="default"/>
-      </w:rPr>
-    </w:lvl>
-    <w:lvl w:ilvl="3">
-      <w:start w:val="1"/>
-      <w:numFmt w:val="bullet"/>
-      <w:lvlText w:val=""/>
-      <w:lvlJc w:val="left"/>
-      <w:pPr>
-        <w:tabs>
-          <w:tab w:val="num" w:pos="2836"/>
-        </w:tabs>
-        <w:ind w:left="2836" w:hanging="283"/>
-      </w:pPr>
-      <w:rPr>
-        <w:rFonts w:ascii="Symbol" w:hAnsi="Symbol" w:cs="Symbol" w:hint="default"/>
-      </w:rPr>
-    </w:lvl>
-    <w:lvl w:ilvl="4">
-      <w:start w:val="1"/>
-      <w:numFmt w:val="bullet"/>
-      <w:lvlText w:val=""/>
-      <w:lvlJc w:val="left"/>
-      <w:pPr>
-        <w:tabs>
-          <w:tab w:val="num" w:pos="3545"/>
-        </w:tabs>
-        <w:ind w:left="3545" w:hanging="283"/>
-      </w:pPr>
-      <w:rPr>
-        <w:rFonts w:ascii="Symbol" w:hAnsi="Symbol" w:cs="Symbol" w:hint="default"/>
-      </w:rPr>
-    </w:lvl>
-    <w:lvl w:ilvl="5">
-      <w:start w:val="1"/>
-      <w:numFmt w:val="bullet"/>
-      <w:lvlText w:val=""/>
-      <w:lvlJc w:val="left"/>
-      <w:pPr>
-        <w:tabs>
-          <w:tab w:val="num" w:pos="4254"/>
-        </w:tabs>
-        <w:ind w:left="4254" w:hanging="283"/>
-      </w:pPr>
-      <w:rPr>
-        <w:rFonts w:ascii="Symbol" w:hAnsi="Symbol" w:cs="Symbol" w:hint="default"/>
-      </w:rPr>
-    </w:lvl>
-    <w:lvl w:ilvl="6">
-      <w:start w:val="1"/>
-      <w:numFmt w:val="bullet"/>
-      <w:lvlText w:val=""/>
-      <w:lvlJc w:val="left"/>
-      <w:pPr>
-        <w:tabs>
-          <w:tab w:val="num" w:pos="4963"/>
-        </w:tabs>
-        <w:ind w:left="4963" w:hanging="283"/>
-      </w:pPr>
-      <w:rPr>
-        <w:rFonts w:ascii="Symbol" w:hAnsi="Symbol" w:cs="Symbol" w:hint="default"/>
-      </w:rPr>
-    </w:lvl>
-    <w:lvl w:ilvl="7">
-      <w:start w:val="1"/>
-      <w:numFmt w:val="bullet"/>
-      <w:lvlText w:val=""/>
-      <w:lvlJc w:val="left"/>
-      <w:pPr>
-        <w:tabs>
-          <w:tab w:val="num" w:pos="5672"/>
-        </w:tabs>
-        <w:ind w:left="5672" w:hanging="283"/>
-      </w:pPr>
-      <w:rPr>
-        <w:rFonts w:ascii="Symbol" w:hAnsi="Symbol" w:cs="Symbol" w:hint="default"/>
-      </w:rPr>
-    </w:lvl>
-    <w:lvl w:ilvl="8">
-      <w:start w:val="1"/>
-      <w:numFmt w:val="bullet"/>
-      <w:lvlText w:val=""/>
-      <w:lvlJc w:val="left"/>
-      <w:pPr>
-        <w:tabs>
-          <w:tab w:val="num" w:pos="6381"/>
-        </w:tabs>
-        <w:ind w:left="6381" w:hanging="283"/>
-      </w:pPr>
-      <w:rPr>
-        <w:rFonts w:ascii="Symbol" w:hAnsi="Symbol" w:cs="Symbol" w:hint="default"/>
-      </w:rPr>
-    </w:lvl>
-  </w:abstractNum>
-  <w:abstractNum w:abstractNumId="58">
-    <w:lvl w:ilvl="0">
-      <w:start w:val="1"/>
-      <w:numFmt w:val="bullet"/>
-      <w:lvlText w:val=""/>
-      <w:lvlJc w:val="left"/>
-      <w:pPr>
-        <w:tabs>
-          <w:tab w:val="num" w:pos="709"/>
-        </w:tabs>
-        <w:ind w:left="709" w:hanging="283"/>
-      </w:pPr>
-      <w:rPr>
-        <w:rFonts w:ascii="Symbol" w:hAnsi="Symbol" w:cs="Symbol" w:hint="default"/>
-      </w:rPr>
-    </w:lvl>
-    <w:lvl w:ilvl="1">
-      <w:start w:val="1"/>
-      <w:numFmt w:val="bullet"/>
-      <w:lvlText w:val=""/>
-      <w:lvlJc w:val="left"/>
-      <w:pPr>
-        <w:tabs>
-          <w:tab w:val="num" w:pos="1418"/>
-        </w:tabs>
-        <w:ind w:left="1418" w:hanging="283"/>
-      </w:pPr>
-      <w:rPr>
-        <w:rFonts w:ascii="Symbol" w:hAnsi="Symbol" w:cs="Symbol" w:hint="default"/>
-      </w:rPr>
-    </w:lvl>
-    <w:lvl w:ilvl="2">
-      <w:start w:val="1"/>
-      <w:numFmt w:val="bullet"/>
-      <w:lvlText w:val=""/>
-      <w:lvlJc w:val="left"/>
-      <w:pPr>
-        <w:tabs>
-          <w:tab w:val="num" w:pos="2127"/>
-        </w:tabs>
-        <w:ind w:left="2127" w:hanging="283"/>
-      </w:pPr>
-      <w:rPr>
-        <w:rFonts w:ascii="Symbol" w:hAnsi="Symbol" w:cs="Symbol" w:hint="default"/>
-      </w:rPr>
-    </w:lvl>
-    <w:lvl w:ilvl="3">
-      <w:start w:val="1"/>
-      <w:numFmt w:val="bullet"/>
-      <w:lvlText w:val=""/>
-      <w:lvlJc w:val="left"/>
-      <w:pPr>
-        <w:tabs>
-          <w:tab w:val="num" w:pos="2836"/>
-        </w:tabs>
-        <w:ind w:left="2836" w:hanging="283"/>
-      </w:pPr>
-      <w:rPr>
-        <w:rFonts w:ascii="Symbol" w:hAnsi="Symbol" w:cs="Symbol" w:hint="default"/>
-      </w:rPr>
-    </w:lvl>
-    <w:lvl w:ilvl="4">
-      <w:start w:val="1"/>
-      <w:numFmt w:val="bullet"/>
-      <w:lvlText w:val=""/>
-      <w:lvlJc w:val="left"/>
-      <w:pPr>
-        <w:tabs>
-          <w:tab w:val="num" w:pos="3545"/>
-        </w:tabs>
-        <w:ind w:left="3545" w:hanging="283"/>
-      </w:pPr>
-      <w:rPr>
-        <w:rFonts w:ascii="Symbol" w:hAnsi="Symbol" w:cs="Symbol" w:hint="default"/>
-      </w:rPr>
-    </w:lvl>
-    <w:lvl w:ilvl="5">
-      <w:start w:val="1"/>
-      <w:numFmt w:val="bullet"/>
-      <w:lvlText w:val=""/>
-      <w:lvlJc w:val="left"/>
-      <w:pPr>
-        <w:tabs>
-          <w:tab w:val="num" w:pos="4254"/>
-        </w:tabs>
-        <w:ind w:left="4254" w:hanging="283"/>
-      </w:pPr>
-      <w:rPr>
-        <w:rFonts w:ascii="Symbol" w:hAnsi="Symbol" w:cs="Symbol" w:hint="default"/>
-      </w:rPr>
-    </w:lvl>
-    <w:lvl w:ilvl="6">
-      <w:start w:val="1"/>
-      <w:numFmt w:val="bullet"/>
-      <w:lvlText w:val=""/>
-      <w:lvlJc w:val="left"/>
-      <w:pPr>
-        <w:tabs>
-          <w:tab w:val="num" w:pos="4963"/>
-        </w:tabs>
-        <w:ind w:left="4963" w:hanging="283"/>
-      </w:pPr>
-      <w:rPr>
-        <w:rFonts w:ascii="Symbol" w:hAnsi="Symbol" w:cs="Symbol" w:hint="default"/>
-      </w:rPr>
-    </w:lvl>
-    <w:lvl w:ilvl="7">
-      <w:start w:val="1"/>
-      <w:numFmt w:val="bullet"/>
-      <w:lvlText w:val=""/>
-      <w:lvlJc w:val="left"/>
-      <w:pPr>
-        <w:tabs>
-          <w:tab w:val="num" w:pos="5672"/>
-        </w:tabs>
-        <w:ind w:left="5672" w:hanging="283"/>
-      </w:pPr>
-      <w:rPr>
-        <w:rFonts w:ascii="Symbol" w:hAnsi="Symbol" w:cs="Symbol" w:hint="default"/>
-      </w:rPr>
-    </w:lvl>
-    <w:lvl w:ilvl="8">
-      <w:start w:val="1"/>
-      <w:numFmt w:val="bullet"/>
-      <w:lvlText w:val=""/>
-      <w:lvlJc w:val="left"/>
-      <w:pPr>
-        <w:tabs>
-          <w:tab w:val="num" w:pos="6381"/>
-        </w:tabs>
-        <w:ind w:left="6381" w:hanging="283"/>
-      </w:pPr>
-      <w:rPr>
-        <w:rFonts w:ascii="Symbol" w:hAnsi="Symbol" w:cs="Symbol" w:hint="default"/>
-      </w:rPr>
-    </w:lvl>
-  </w:abstractNum>
-  <w:abstractNum w:abstractNumId="59">
-    <w:lvl w:ilvl="0">
-      <w:start w:val="1"/>
       <w:numFmt w:val="none"/>
       <w:suff w:val="nothing"/>
       <w:lvlText w:val=""/>
@@ -25115,42 +21707,6 @@
   </w:num>
   <w:num w:numId="47">
     <w:abstractNumId w:val="47"/>
-  </w:num>
-  <w:num w:numId="48">
-    <w:abstractNumId w:val="48"/>
-  </w:num>
-  <w:num w:numId="49">
-    <w:abstractNumId w:val="49"/>
-  </w:num>
-  <w:num w:numId="50">
-    <w:abstractNumId w:val="50"/>
-  </w:num>
-  <w:num w:numId="51">
-    <w:abstractNumId w:val="51"/>
-  </w:num>
-  <w:num w:numId="52">
-    <w:abstractNumId w:val="52"/>
-  </w:num>
-  <w:num w:numId="53">
-    <w:abstractNumId w:val="53"/>
-  </w:num>
-  <w:num w:numId="54">
-    <w:abstractNumId w:val="54"/>
-  </w:num>
-  <w:num w:numId="55">
-    <w:abstractNumId w:val="55"/>
-  </w:num>
-  <w:num w:numId="56">
-    <w:abstractNumId w:val="56"/>
-  </w:num>
-  <w:num w:numId="57">
-    <w:abstractNumId w:val="57"/>
-  </w:num>
-  <w:num w:numId="58">
-    <w:abstractNumId w:val="58"/>
-  </w:num>
-  <w:num w:numId="59">
-    <w:abstractNumId w:val="59"/>
   </w:num>
 </w:numbering>
 </file>

</xml_diff>